<commit_message>
docs: update v1.0.0 documentation
Co-Authored-By: Claude Sonnet 4.6 <noreply@anthropic.com>
</commit_message>
<xml_diff>
--- a/docs/RouteFlow-v1.0.0-Documentation.docx
+++ b/docs/RouteFlow-v1.0.0-Documentation.docx
@@ -354,91 +354,18 @@
     </w:p>
     <w:p>
       <w:pPr>
-        <w:spacing w:after="60" w:before="60"/>
-      </w:pPr>
-      <w:r>
-        <w:rPr>
-          <w:rFonts w:ascii="Arial" w:cs="Arial" w:eastAsia="Arial" w:hAnsi="Arial"/>
-          <w:b/>
-          <w:bCs/>
-          <w:sz w:val="20"/>
-          <w:szCs w:val="20"/>
-        </w:rPr>
-        <w:t xml:space="preserve">OPERATOR / TENANT_ADMIN: </w:t>
-      </w:r>
-      <w:r>
-        <w:rPr>
-          <w:rFonts w:ascii="Arial" w:cs="Arial" w:eastAsia="Arial" w:hAnsi="Arial"/>
-          <w:sz w:val="20"/>
-          <w:szCs w:val="20"/>
-        </w:rPr>
-        <w:t xml:space="preserve">The business owner or office manager. Full access to all features — managing customers, products, inventory, orders, routes, invoices, finance reports, and account settings.</w:t>
-      </w:r>
-    </w:p>
-    <w:p>
-      <w:r>
-        <w:rPr>
-          <w:rFonts w:ascii="Arial" w:cs="Arial" w:eastAsia="Arial" w:hAnsi="Arial"/>
-          <w:sz w:val="20"/>
-          <w:szCs w:val="20"/>
-        </w:rPr>
-        <w:t xml:space="preserve"/>
-      </w:r>
-    </w:p>
-    <w:p>
-      <w:pPr>
-        <w:spacing w:after="60" w:before="60"/>
-      </w:pPr>
-      <w:r>
-        <w:rPr>
-          <w:rFonts w:ascii="Arial" w:cs="Arial" w:eastAsia="Arial" w:hAnsi="Arial"/>
-          <w:b/>
-          <w:bCs/>
-          <w:sz w:val="20"/>
-          <w:szCs w:val="20"/>
-        </w:rPr>
-        <w:t xml:space="preserve">DRIVER: </w:t>
-      </w:r>
-      <w:r>
-        <w:rPr>
-          <w:rFonts w:ascii="Arial" w:cs="Arial" w:eastAsia="Arial" w:hAnsi="Arial"/>
-          <w:sz w:val="20"/>
-          <w:szCs w:val="20"/>
-        </w:rPr>
-        <w:t xml:space="preserve">Field staff who execute deliveries. Access via the mobile app. Views assigned routes and stops, marks deliveries complete, records failed deliveries, submits expenses, and collects payments on delivery.</w:t>
-      </w:r>
-    </w:p>
-    <w:p>
-      <w:r>
-        <w:rPr>
-          <w:rFonts w:ascii="Arial" w:cs="Arial" w:eastAsia="Arial" w:hAnsi="Arial"/>
-          <w:sz w:val="20"/>
-          <w:szCs w:val="20"/>
-        </w:rPr>
-        <w:t xml:space="preserve"/>
-      </w:r>
-    </w:p>
-    <w:p>
-      <w:pPr>
-        <w:spacing w:after="60" w:before="60"/>
-      </w:pPr>
-      <w:r>
-        <w:rPr>
-          <w:rFonts w:ascii="Arial" w:cs="Arial" w:eastAsia="Arial" w:hAnsi="Arial"/>
-          <w:b/>
-          <w:bCs/>
-          <w:sz w:val="20"/>
-          <w:szCs w:val="20"/>
-        </w:rPr>
-        <w:t xml:space="preserve">CUSTOMER: </w:t>
-      </w:r>
-      <w:r>
-        <w:rPr>
-          <w:rFonts w:ascii="Arial" w:cs="Arial" w:eastAsia="Arial" w:hAnsi="Arial"/>
-          <w:sz w:val="20"/>
-          <w:szCs w:val="20"/>
-        </w:rPr>
-        <w:t xml:space="preserve">The end buyer accessing their own account portal. Can view their orders, invoices, credit balance, and account statement. Cannot place new orders directly through the portal.</w:t>
+        <w:spacing w:after="80" w:before="80"/>
+      </w:pPr>
+      <w:r>
+        <w:rPr>
+          <w:rFonts w:ascii="Arial" w:cs="Arial" w:eastAsia="Arial" w:hAnsi="Arial"/>
+          <w:i/>
+          <w:iCs/>
+          <w:color w:val="999999"/>
+          <w:sz w:val="18"/>
+          <w:szCs w:val="18"/>
+        </w:rPr>
+        <w:t xml:space="preserve">[Screenshot not available: 1.3-railway-dashboard.png]</w:t>
       </w:r>
     </w:p>
     <w:p>
@@ -463,7 +390,133 @@
           <w:sz w:val="26"/>
           <w:szCs w:val="26"/>
         </w:rPr>
-        <w:t xml:space="preserve">1.3 System Architecture</w:t>
+        <w:t xml:space="preserve">1.4 Accessing RouteFlow</w:t>
+      </w:r>
+    </w:p>
+    <w:p>
+      <w:pPr>
+        <w:pStyle w:val="ListParagraph"/>
+        <w:numPr>
+          <w:ilvl w:val="0"/>
+          <w:numId w:val="2"/>
+        </w:numPr>
+      </w:pPr>
+      <w:r>
+        <w:rPr>
+          <w:rFonts w:ascii="Arial" w:cs="Arial" w:eastAsia="Arial" w:hAnsi="Arial"/>
+          <w:b w:val="false"/>
+          <w:bCs w:val="false"/>
+          <w:sz w:val="20"/>
+          <w:szCs w:val="20"/>
+        </w:rPr>
+        <w:t xml:space="preserve">Web app: Open Chrome or Edge and navigate to your RouteFlow URL (provided by your administrator)</w:t>
+      </w:r>
+    </w:p>
+    <w:p>
+      <w:pPr>
+        <w:pStyle w:val="ListParagraph"/>
+        <w:numPr>
+          <w:ilvl w:val="0"/>
+          <w:numId w:val="2"/>
+        </w:numPr>
+      </w:pPr>
+      <w:r>
+        <w:rPr>
+          <w:rFonts w:ascii="Arial" w:cs="Arial" w:eastAsia="Arial" w:hAnsi="Arial"/>
+          <w:b w:val="false"/>
+          <w:bCs w:val="false"/>
+          <w:sz w:val="20"/>
+          <w:szCs w:val="20"/>
+        </w:rPr>
+        <w:t xml:space="preserve">Optimal display: 1440px width or wider for the operator interface</w:t>
+      </w:r>
+    </w:p>
+    <w:p>
+      <w:pPr>
+        <w:pStyle w:val="ListParagraph"/>
+        <w:numPr>
+          <w:ilvl w:val="0"/>
+          <w:numId w:val="2"/>
+        </w:numPr>
+      </w:pPr>
+      <w:r>
+        <w:rPr>
+          <w:rFonts w:ascii="Arial" w:cs="Arial" w:eastAsia="Arial" w:hAnsi="Arial"/>
+          <w:b w:val="false"/>
+          <w:bCs w:val="false"/>
+          <w:sz w:val="20"/>
+          <w:szCs w:val="20"/>
+        </w:rPr>
+        <w:t xml:space="preserve">Driver app: Install the RouteFlow Driver app from the App Store or Google Play; log in with your company code and credentials</w:t>
+      </w:r>
+    </w:p>
+    <w:p>
+      <w:pPr>
+        <w:pStyle w:val="ListParagraph"/>
+        <w:numPr>
+          <w:ilvl w:val="0"/>
+          <w:numId w:val="2"/>
+        </w:numPr>
+      </w:pPr>
+      <w:r>
+        <w:rPr>
+          <w:rFonts w:ascii="Arial" w:cs="Arial" w:eastAsia="Arial" w:hAnsi="Arial"/>
+          <w:b w:val="false"/>
+          <w:bCs w:val="false"/>
+          <w:sz w:val="20"/>
+          <w:szCs w:val="20"/>
+        </w:rPr>
+        <w:t xml:space="preserve">Mobile web: Supported on Safari (iOS) and Chrome (Android) at 390px width</w:t>
+      </w:r>
+    </w:p>
+    <w:p>
+      <w:r>
+        <w:rPr>
+          <w:rFonts w:ascii="Arial" w:cs="Arial" w:eastAsia="Arial" w:hAnsi="Arial"/>
+          <w:sz w:val="20"/>
+          <w:szCs w:val="20"/>
+        </w:rPr>
+        <w:t xml:space="preserve"/>
+      </w:r>
+    </w:p>
+    <w:p>
+      <w:pPr>
+        <w:pStyle w:val="Heading1"/>
+      </w:pPr>
+      <w:r>
+        <w:rPr>
+          <w:rFonts w:ascii="Arial" w:cs="Arial" w:eastAsia="Arial" w:hAnsi="Arial"/>
+          <w:b/>
+          <w:bCs/>
+          <w:sz w:val="32"/>
+          <w:szCs w:val="32"/>
+        </w:rPr>
+        <w:t xml:space="preserve">PART 2 — GETTING STARTED</w:t>
+      </w:r>
+    </w:p>
+    <w:p>
+      <w:r>
+        <w:rPr>
+          <w:rFonts w:ascii="Arial" w:cs="Arial" w:eastAsia="Arial" w:hAnsi="Arial"/>
+          <w:sz w:val="20"/>
+          <w:szCs w:val="20"/>
+        </w:rPr>
+        <w:t xml:space="preserve"/>
+      </w:r>
+    </w:p>
+    <w:p>
+      <w:pPr>
+        <w:pStyle w:val="Heading2"/>
+      </w:pPr>
+      <w:r>
+        <w:rPr>
+          <w:rFonts w:ascii="Arial" w:cs="Arial" w:eastAsia="Arial" w:hAnsi="Arial"/>
+          <w:b/>
+          <w:bCs/>
+          <w:sz w:val="26"/>
+          <w:szCs w:val="26"/>
+        </w:rPr>
+        <w:t xml:space="preserve">2.1 Logging In</w:t>
       </w:r>
     </w:p>
     <w:p>
@@ -482,7 +535,7 @@
           <w:sz w:val="20"/>
           <w:szCs w:val="20"/>
         </w:rPr>
-        <w:t xml:space="preserve">RouteFlow is a cloud-hosted web application deployed on Railway. Data is stored in a PostgreSQL database. Authentication uses JWT tokens (access + refresh). Address geocoding uses the OpenStreetMap Photon API. Outbound email is sent via SMTP (configurable per tenant). Mobile push notifications use Firebase Cloud Messaging (FCM). The driver mobile app is built with React Native (Expo) and works on iOS and Android.</w:t>
+        <w:t xml:space="preserve">Navigate to your RouteFlow URL. Enter your username and password. Press Enter on the username field to move to the password field, or press Enter on the password field to submit. Click Sign In. If your organization has Google OAuth configured, a "Sign in with Google" button will also appear.</w:t>
       </w:r>
     </w:p>
     <w:p>
@@ -497,20 +550,45 @@
     </w:p>
     <w:p>
       <w:pPr>
-        <w:spacing w:after="80" w:before="80"/>
-      </w:pPr>
-      <w:r>
-        <w:rPr>
-          <w:rFonts w:ascii="Arial" w:cs="Arial" w:eastAsia="Arial" w:hAnsi="Arial"/>
-          <w:b/>
-          <w:bCs/>
-          <w:i/>
-          <w:iCs/>
-          <w:color w:val="666666"/>
-          <w:sz w:val="20"/>
-          <w:szCs w:val="20"/>
-        </w:rPr>
-        <w:t xml:space="preserve">[SCREENSHOT: 1.3-railway-dashboard.png]</w:t>
+        <w:jc w:val="center"/>
+        <w:spacing w:after="120" w:before="60"/>
+      </w:pPr>
+      <w:r>
+        <w:drawing>
+          <wp:inline distT="0" distB="0" distL="0" distR="0">
+            <wp:extent cx="5943600" cy="3714750"/>
+            <wp:effectExtent l="0" t="0" r="0" b="0"/>
+            <wp:docPr id="1" name="2_1-login-page_png" descr="2.1-login-page.png"/>
+            <wp:cNvGraphicFramePr>
+              <a:graphicFrameLocks xmlns:a="http://schemas.openxmlformats.org/drawingml/2006/main" noChangeAspect="1"/>
+            </wp:cNvGraphicFramePr>
+            <a:graphic xmlns:a="http://schemas.openxmlformats.org/drawingml/2006/main">
+              <a:graphicData uri="http://schemas.openxmlformats.org/drawingml/2006/picture">
+                <pic:pic xmlns:pic="http://schemas.openxmlformats.org/drawingml/2006/picture">
+                  <pic:nvPicPr>
+                    <pic:cNvPr id="1" name="2_1-login-page_png"/>
+                    <pic:cNvPicPr/>
+                  </pic:nvPicPr>
+                  <pic:blipFill>
+                    <a:blip r:embed="rId10"/>
+                    <a:stretch>
+                      <a:fillRect/>
+                    </a:stretch>
+                  </pic:blipFill>
+                  <pic:spPr>
+                    <a:xfrm>
+                      <a:off x="0" y="0"/>
+                      <a:ext cx="5943600" cy="3714750"/>
+                    </a:xfrm>
+                    <a:prstGeom prst="rect">
+                      <a:avLst/>
+                    </a:prstGeom>
+                  </pic:spPr>
+                </pic:pic>
+              </a:graphicData>
+            </a:graphic>
+          </wp:inline>
+        </w:drawing>
       </w:r>
     </w:p>
     <w:p>
@@ -535,7 +613,546 @@
           <w:sz w:val="26"/>
           <w:szCs w:val="26"/>
         </w:rPr>
-        <w:t xml:space="preserve">1.4 Accessing RouteFlow</w:t>
+        <w:t xml:space="preserve">2.2 Password Reset</w:t>
+      </w:r>
+    </w:p>
+    <w:p>
+      <w:pPr>
+        <w:spacing w:after="80" w:before="0"/>
+        <w:jc w:val="left"/>
+      </w:pPr>
+      <w:r>
+        <w:rPr>
+          <w:rFonts w:ascii="Arial" w:cs="Arial" w:eastAsia="Arial" w:hAnsi="Arial"/>
+          <w:b w:val="false"/>
+          <w:bCs w:val="false"/>
+          <w:i w:val="false"/>
+          <w:iCs w:val="false"/>
+          <w:color w:val="000000"/>
+          <w:sz w:val="20"/>
+          <w:szCs w:val="20"/>
+        </w:rPr>
+        <w:t xml:space="preserve">Passwords are managed by your account administrator. If you forget your password, contact your administrator — they can issue a temporary password from Settings → Team. On your next login, the system will require you to set a new password before you can proceed. If your organization has Google OAuth enabled, you can log in with your Google account without a password.</w:t>
+      </w:r>
+    </w:p>
+    <w:p>
+      <w:r>
+        <w:rPr>
+          <w:rFonts w:ascii="Arial" w:cs="Arial" w:eastAsia="Arial" w:hAnsi="Arial"/>
+          <w:sz w:val="20"/>
+          <w:szCs w:val="20"/>
+        </w:rPr>
+        <w:t xml:space="preserve"/>
+      </w:r>
+    </w:p>
+    <w:p>
+      <w:pPr>
+        <w:jc w:val="center"/>
+        <w:spacing w:after="120" w:before="60"/>
+      </w:pPr>
+      <w:r>
+        <w:drawing>
+          <wp:inline distT="0" distB="0" distL="0" distR="0">
+            <wp:extent cx="5943600" cy="3714750"/>
+            <wp:effectExtent l="0" t="0" r="0" b="0"/>
+            <wp:docPr id="2" name="2_2-force-password-change_png" descr="2.2-force-password-change.png"/>
+            <wp:cNvGraphicFramePr>
+              <a:graphicFrameLocks xmlns:a="http://schemas.openxmlformats.org/drawingml/2006/main" noChangeAspect="1"/>
+            </wp:cNvGraphicFramePr>
+            <a:graphic xmlns:a="http://schemas.openxmlformats.org/drawingml/2006/main">
+              <a:graphicData uri="http://schemas.openxmlformats.org/drawingml/2006/picture">
+                <pic:pic xmlns:pic="http://schemas.openxmlformats.org/drawingml/2006/picture">
+                  <pic:nvPicPr>
+                    <pic:cNvPr id="2" name="2_2-force-password-change_png"/>
+                    <pic:cNvPicPr/>
+                  </pic:nvPicPr>
+                  <pic:blipFill>
+                    <a:blip r:embed="rId11"/>
+                    <a:stretch>
+                      <a:fillRect/>
+                    </a:stretch>
+                  </pic:blipFill>
+                  <pic:spPr>
+                    <a:xfrm>
+                      <a:off x="0" y="0"/>
+                      <a:ext cx="5943600" cy="3714750"/>
+                    </a:xfrm>
+                    <a:prstGeom prst="rect">
+                      <a:avLst/>
+                    </a:prstGeom>
+                  </pic:spPr>
+                </pic:pic>
+              </a:graphicData>
+            </a:graphic>
+          </wp:inline>
+        </w:drawing>
+      </w:r>
+    </w:p>
+    <w:p>
+      <w:r>
+        <w:rPr>
+          <w:rFonts w:ascii="Arial" w:cs="Arial" w:eastAsia="Arial" w:hAnsi="Arial"/>
+          <w:sz w:val="20"/>
+          <w:szCs w:val="20"/>
+        </w:rPr>
+        <w:t xml:space="preserve"/>
+      </w:r>
+    </w:p>
+    <w:p>
+      <w:pPr>
+        <w:pStyle w:val="Heading2"/>
+      </w:pPr>
+      <w:r>
+        <w:rPr>
+          <w:rFonts w:ascii="Arial" w:cs="Arial" w:eastAsia="Arial" w:hAnsi="Arial"/>
+          <w:b/>
+          <w:bCs/>
+          <w:sz w:val="26"/>
+          <w:szCs w:val="26"/>
+        </w:rPr>
+        <w:t xml:space="preserve">2.3 Your Dashboard</w:t>
+      </w:r>
+    </w:p>
+    <w:p>
+      <w:pPr>
+        <w:spacing w:after="80" w:before="0"/>
+        <w:jc w:val="left"/>
+      </w:pPr>
+      <w:r>
+        <w:rPr>
+          <w:rFonts w:ascii="Arial" w:cs="Arial" w:eastAsia="Arial" w:hAnsi="Arial"/>
+          <w:b w:val="false"/>
+          <w:bCs w:val="false"/>
+          <w:i w:val="false"/>
+          <w:iCs w:val="false"/>
+          <w:color w:val="000000"/>
+          <w:sz w:val="20"/>
+          <w:szCs w:val="20"/>
+        </w:rPr>
+        <w:t xml:space="preserve">After logging in, you are taken to your role-specific dashboard:</w:t>
+      </w:r>
+    </w:p>
+    <w:p>
+      <w:r>
+        <w:rPr>
+          <w:rFonts w:ascii="Arial" w:cs="Arial" w:eastAsia="Arial" w:hAnsi="Arial"/>
+          <w:sz w:val="20"/>
+          <w:szCs w:val="20"/>
+        </w:rPr>
+        <w:t xml:space="preserve"/>
+      </w:r>
+    </w:p>
+    <w:p>
+      <w:pPr>
+        <w:jc w:val="center"/>
+        <w:spacing w:after="120" w:before="60"/>
+      </w:pPr>
+      <w:r>
+        <w:drawing>
+          <wp:inline distT="0" distB="0" distL="0" distR="0">
+            <wp:extent cx="5943600" cy="3714750"/>
+            <wp:effectExtent l="0" t="0" r="0" b="0"/>
+            <wp:docPr id="3" name="2_3-operator-dashboard_png" descr="2.3-operator-dashboard.png"/>
+            <wp:cNvGraphicFramePr>
+              <a:graphicFrameLocks xmlns:a="http://schemas.openxmlformats.org/drawingml/2006/main" noChangeAspect="1"/>
+            </wp:cNvGraphicFramePr>
+            <a:graphic xmlns:a="http://schemas.openxmlformats.org/drawingml/2006/main">
+              <a:graphicData uri="http://schemas.openxmlformats.org/drawingml/2006/picture">
+                <pic:pic xmlns:pic="http://schemas.openxmlformats.org/drawingml/2006/picture">
+                  <pic:nvPicPr>
+                    <pic:cNvPr id="3" name="2_3-operator-dashboard_png"/>
+                    <pic:cNvPicPr/>
+                  </pic:nvPicPr>
+                  <pic:blipFill>
+                    <a:blip r:embed="rId13"/>
+                    <a:stretch>
+                      <a:fillRect/>
+                    </a:stretch>
+                  </pic:blipFill>
+                  <pic:spPr>
+                    <a:xfrm>
+                      <a:off x="0" y="0"/>
+                      <a:ext cx="5943600" cy="3714750"/>
+                    </a:xfrm>
+                    <a:prstGeom prst="rect">
+                      <a:avLst/>
+                    </a:prstGeom>
+                  </pic:spPr>
+                </pic:pic>
+              </a:graphicData>
+            </a:graphic>
+          </wp:inline>
+        </w:drawing>
+      </w:r>
+    </w:p>
+    <w:p>
+      <w:pPr>
+        <w:spacing w:after="80" w:before="80"/>
+      </w:pPr>
+      <w:r>
+        <w:rPr>
+          <w:rFonts w:ascii="Arial" w:cs="Arial" w:eastAsia="Arial" w:hAnsi="Arial"/>
+          <w:i/>
+          <w:iCs/>
+          <w:color w:val="999999"/>
+          <w:sz w:val="18"/>
+          <w:szCs w:val="18"/>
+        </w:rPr>
+        <w:t xml:space="preserve">[Screenshot not available: 2.3-driver-dashboard-mobile.png]</w:t>
+      </w:r>
+    </w:p>
+    <w:p>
+      <w:pPr>
+        <w:jc w:val="center"/>
+        <w:spacing w:after="120" w:before="60"/>
+      </w:pPr>
+      <w:r>
+        <w:drawing>
+          <wp:inline distT="0" distB="0" distL="0" distR="0">
+            <wp:extent cx="5943600" cy="3714750"/>
+            <wp:effectExtent l="0" t="0" r="0" b="0"/>
+            <wp:docPr id="4" name="2_3-customer-dashboard_png" descr="2.3-customer-dashboard.png"/>
+            <wp:cNvGraphicFramePr>
+              <a:graphicFrameLocks xmlns:a="http://schemas.openxmlformats.org/drawingml/2006/main" noChangeAspect="1"/>
+            </wp:cNvGraphicFramePr>
+            <a:graphic xmlns:a="http://schemas.openxmlformats.org/drawingml/2006/main">
+              <a:graphicData uri="http://schemas.openxmlformats.org/drawingml/2006/picture">
+                <pic:pic xmlns:pic="http://schemas.openxmlformats.org/drawingml/2006/picture">
+                  <pic:nvPicPr>
+                    <pic:cNvPr id="4" name="2_3-customer-dashboard_png"/>
+                    <pic:cNvPicPr/>
+                  </pic:nvPicPr>
+                  <pic:blipFill>
+                    <a:blip r:embed="rId12"/>
+                    <a:stretch>
+                      <a:fillRect/>
+                    </a:stretch>
+                  </pic:blipFill>
+                  <pic:spPr>
+                    <a:xfrm>
+                      <a:off x="0" y="0"/>
+                      <a:ext cx="5943600" cy="3714750"/>
+                    </a:xfrm>
+                    <a:prstGeom prst="rect">
+                      <a:avLst/>
+                    </a:prstGeom>
+                  </pic:spPr>
+                </pic:pic>
+              </a:graphicData>
+            </a:graphic>
+          </wp:inline>
+        </w:drawing>
+      </w:r>
+    </w:p>
+    <w:p>
+      <w:r>
+        <w:rPr>
+          <w:rFonts w:ascii="Arial" w:cs="Arial" w:eastAsia="Arial" w:hAnsi="Arial"/>
+          <w:sz w:val="20"/>
+          <w:szCs w:val="20"/>
+        </w:rPr>
+        <w:t xml:space="preserve"/>
+      </w:r>
+    </w:p>
+    <w:p>
+      <w:pPr>
+        <w:pStyle w:val="Heading2"/>
+      </w:pPr>
+      <w:r>
+        <w:rPr>
+          <w:rFonts w:ascii="Arial" w:cs="Arial" w:eastAsia="Arial" w:hAnsi="Arial"/>
+          <w:b/>
+          <w:bCs/>
+          <w:sz w:val="26"/>
+          <w:szCs w:val="26"/>
+        </w:rPr>
+        <w:t xml:space="preserve">2.4 Navigation</w:t>
+      </w:r>
+    </w:p>
+    <w:p>
+      <w:pPr>
+        <w:spacing w:after="80" w:before="0"/>
+        <w:jc w:val="left"/>
+      </w:pPr>
+      <w:r>
+        <w:rPr>
+          <w:rFonts w:ascii="Arial" w:cs="Arial" w:eastAsia="Arial" w:hAnsi="Arial"/>
+          <w:b w:val="false"/>
+          <w:bCs w:val="false"/>
+          <w:i w:val="false"/>
+          <w:iCs w:val="false"/>
+          <w:color w:val="000000"/>
+          <w:sz w:val="20"/>
+          <w:szCs w:val="20"/>
+        </w:rPr>
+        <w:t xml:space="preserve">Operator/Admin: A collapsible sidebar on the left shows all modules: Dashboard, Customers, Orders, Returns, Routes, Drivers, Products, Inventory, Suppliers, Invoices, Estimates, Credit Notes, Finance, Analytics, Settings. Collapse to icon-only mode using the arrow button.</w:t>
+      </w:r>
+    </w:p>
+    <w:p>
+      <w:r>
+        <w:rPr>
+          <w:rFonts w:ascii="Arial" w:cs="Arial" w:eastAsia="Arial" w:hAnsi="Arial"/>
+          <w:sz w:val="20"/>
+          <w:szCs w:val="20"/>
+        </w:rPr>
+        <w:t xml:space="preserve"/>
+      </w:r>
+    </w:p>
+    <w:p>
+      <w:pPr>
+        <w:spacing w:after="80" w:before="0"/>
+        <w:jc w:val="left"/>
+      </w:pPr>
+      <w:r>
+        <w:rPr>
+          <w:rFonts w:ascii="Arial" w:cs="Arial" w:eastAsia="Arial" w:hAnsi="Arial"/>
+          <w:b w:val="false"/>
+          <w:bCs w:val="false"/>
+          <w:i w:val="false"/>
+          <w:iCs w:val="false"/>
+          <w:color w:val="000000"/>
+          <w:sz w:val="20"/>
+          <w:szCs w:val="20"/>
+        </w:rPr>
+        <w:t xml:space="preserve">Customer: Left sidebar shows Dashboard, Orders, Returns, Invoices, Settings only.</w:t>
+      </w:r>
+    </w:p>
+    <w:p>
+      <w:r>
+        <w:rPr>
+          <w:rFonts w:ascii="Arial" w:cs="Arial" w:eastAsia="Arial" w:hAnsi="Arial"/>
+          <w:sz w:val="20"/>
+          <w:szCs w:val="20"/>
+        </w:rPr>
+        <w:t xml:space="preserve"/>
+      </w:r>
+    </w:p>
+    <w:p>
+      <w:pPr>
+        <w:spacing w:after="80" w:before="0"/>
+        <w:jc w:val="left"/>
+      </w:pPr>
+      <w:r>
+        <w:rPr>
+          <w:rFonts w:ascii="Arial" w:cs="Arial" w:eastAsia="Arial" w:hAnsi="Arial"/>
+          <w:b w:val="false"/>
+          <w:bCs w:val="false"/>
+          <w:i w:val="false"/>
+          <w:iCs w:val="false"/>
+          <w:color w:val="000000"/>
+          <w:sz w:val="20"/>
+          <w:szCs w:val="20"/>
+        </w:rPr>
+        <w:t xml:space="preserve">Driver (mobile): Bottom tab bar shows Dashboard, My Routes, Settings.</w:t>
+      </w:r>
+    </w:p>
+    <w:p>
+      <w:r>
+        <w:rPr>
+          <w:rFonts w:ascii="Arial" w:cs="Arial" w:eastAsia="Arial" w:hAnsi="Arial"/>
+          <w:sz w:val="20"/>
+          <w:szCs w:val="20"/>
+        </w:rPr>
+        <w:t xml:space="preserve"/>
+      </w:r>
+    </w:p>
+    <w:p>
+      <w:pPr>
+        <w:spacing w:after="80" w:before="0"/>
+        <w:jc w:val="left"/>
+      </w:pPr>
+      <w:r>
+        <w:rPr>
+          <w:rFonts w:ascii="Arial" w:cs="Arial" w:eastAsia="Arial" w:hAnsi="Arial"/>
+          <w:b w:val="false"/>
+          <w:bCs w:val="false"/>
+          <w:i w:val="false"/>
+          <w:iCs w:val="false"/>
+          <w:color w:val="000000"/>
+          <w:sz w:val="20"/>
+          <w:szCs w:val="20"/>
+        </w:rPr>
+        <w:t xml:space="preserve">The notification bell (top right, web) shows an unread count. Click to see recent notifications. Your user avatar (top right) opens a dropdown with profile and logout options.</w:t>
+      </w:r>
+    </w:p>
+    <w:p>
+      <w:r>
+        <w:rPr>
+          <w:rFonts w:ascii="Arial" w:cs="Arial" w:eastAsia="Arial" w:hAnsi="Arial"/>
+          <w:sz w:val="20"/>
+          <w:szCs w:val="20"/>
+        </w:rPr>
+        <w:t xml:space="preserve"/>
+      </w:r>
+    </w:p>
+    <w:p>
+      <w:pPr>
+        <w:jc w:val="center"/>
+        <w:spacing w:after="120" w:before="60"/>
+      </w:pPr>
+      <w:r>
+        <w:drawing>
+          <wp:inline distT="0" distB="0" distL="0" distR="0">
+            <wp:extent cx="5943600" cy="3714750"/>
+            <wp:effectExtent l="0" t="0" r="0" b="0"/>
+            <wp:docPr id="5" name="2_4-operator-navigation_png" descr="2.4-operator-navigation.png"/>
+            <wp:cNvGraphicFramePr>
+              <a:graphicFrameLocks xmlns:a="http://schemas.openxmlformats.org/drawingml/2006/main" noChangeAspect="1"/>
+            </wp:cNvGraphicFramePr>
+            <a:graphic xmlns:a="http://schemas.openxmlformats.org/drawingml/2006/main">
+              <a:graphicData uri="http://schemas.openxmlformats.org/drawingml/2006/picture">
+                <pic:pic xmlns:pic="http://schemas.openxmlformats.org/drawingml/2006/picture">
+                  <pic:nvPicPr>
+                    <pic:cNvPr id="5" name="2_4-operator-navigation_png"/>
+                    <pic:cNvPicPr/>
+                  </pic:nvPicPr>
+                  <pic:blipFill>
+                    <a:blip r:embed="rId14"/>
+                    <a:stretch>
+                      <a:fillRect/>
+                    </a:stretch>
+                  </pic:blipFill>
+                  <pic:spPr>
+                    <a:xfrm>
+                      <a:off x="0" y="0"/>
+                      <a:ext cx="5943600" cy="3714750"/>
+                    </a:xfrm>
+                    <a:prstGeom prst="rect">
+                      <a:avLst/>
+                    </a:prstGeom>
+                  </pic:spPr>
+                </pic:pic>
+              </a:graphicData>
+            </a:graphic>
+          </wp:inline>
+        </w:drawing>
+      </w:r>
+    </w:p>
+    <w:p>
+      <w:r>
+        <w:rPr>
+          <w:rFonts w:ascii="Arial" w:cs="Arial" w:eastAsia="Arial" w:hAnsi="Arial"/>
+          <w:sz w:val="20"/>
+          <w:szCs w:val="20"/>
+        </w:rPr>
+        <w:t xml:space="preserve"/>
+      </w:r>
+    </w:p>
+    <w:p>
+      <w:pPr>
+        <w:pStyle w:val="Heading1"/>
+      </w:pPr>
+      <w:r>
+        <w:rPr>
+          <w:rFonts w:ascii="Arial" w:cs="Arial" w:eastAsia="Arial" w:hAnsi="Arial"/>
+          <w:b/>
+          <w:bCs/>
+          <w:sz w:val="32"/>
+          <w:szCs w:val="32"/>
+        </w:rPr>
+        <w:t xml:space="preserve">PART 3 — OPERATOR GUIDE</w:t>
+      </w:r>
+    </w:p>
+    <w:p>
+      <w:r>
+        <w:rPr>
+          <w:rFonts w:ascii="Arial" w:cs="Arial" w:eastAsia="Arial" w:hAnsi="Arial"/>
+          <w:sz w:val="20"/>
+          <w:szCs w:val="20"/>
+        </w:rPr>
+        <w:t xml:space="preserve"/>
+      </w:r>
+    </w:p>
+    <w:p>
+      <w:pPr>
+        <w:pStyle w:val="Heading2"/>
+      </w:pPr>
+      <w:r>
+        <w:rPr>
+          <w:rFonts w:ascii="Arial" w:cs="Arial" w:eastAsia="Arial" w:hAnsi="Arial"/>
+          <w:b/>
+          <w:bCs/>
+          <w:sz w:val="26"/>
+          <w:szCs w:val="26"/>
+        </w:rPr>
+        <w:t xml:space="preserve">3.1 Customer Management</w:t>
+      </w:r>
+    </w:p>
+    <w:p>
+      <w:pPr>
+        <w:spacing w:after="80" w:before="0"/>
+        <w:jc w:val="left"/>
+      </w:pPr>
+      <w:r>
+        <w:rPr>
+          <w:rFonts w:ascii="Arial" w:cs="Arial" w:eastAsia="Arial" w:hAnsi="Arial"/>
+          <w:b w:val="false"/>
+          <w:bCs w:val="false"/>
+          <w:i w:val="false"/>
+          <w:iCs w:val="false"/>
+          <w:color w:val="000000"/>
+          <w:sz w:val="20"/>
+          <w:szCs w:val="20"/>
+        </w:rPr>
+        <w:t xml:space="preserve">Customer list: Search by business name, contact name, email, or phone. Filter by status (Active / Inactive). The list shows receivable balances and available credit for each customer.</w:t>
+      </w:r>
+    </w:p>
+    <w:p>
+      <w:r>
+        <w:rPr>
+          <w:rFonts w:ascii="Arial" w:cs="Arial" w:eastAsia="Arial" w:hAnsi="Arial"/>
+          <w:sz w:val="20"/>
+          <w:szCs w:val="20"/>
+        </w:rPr>
+        <w:t xml:space="preserve"/>
+      </w:r>
+    </w:p>
+    <w:p>
+      <w:pPr>
+        <w:spacing w:after="80" w:before="0"/>
+        <w:jc w:val="left"/>
+      </w:pPr>
+      <w:r>
+        <w:rPr>
+          <w:rFonts w:ascii="Arial" w:cs="Arial" w:eastAsia="Arial" w:hAnsi="Arial"/>
+          <w:b w:val="false"/>
+          <w:bCs w:val="false"/>
+          <w:i w:val="false"/>
+          <w:iCs w:val="false"/>
+          <w:color w:val="000000"/>
+          <w:sz w:val="20"/>
+          <w:szCs w:val="20"/>
+        </w:rPr>
+        <w:t xml:space="preserve">Create / edit customer: Fill in business name, contact name, email, phone, billing address (with autocomplete suggestions), customer type, tax ID, payment terms, credit limit, and optional tags.</w:t>
+      </w:r>
+    </w:p>
+    <w:p>
+      <w:r>
+        <w:rPr>
+          <w:rFonts w:ascii="Arial" w:cs="Arial" w:eastAsia="Arial" w:hAnsi="Arial"/>
+          <w:sz w:val="20"/>
+          <w:szCs w:val="20"/>
+        </w:rPr>
+        <w:t xml:space="preserve"/>
+      </w:r>
+    </w:p>
+    <w:p>
+      <w:pPr>
+        <w:spacing w:after="80" w:before="0"/>
+        <w:jc w:val="left"/>
+      </w:pPr>
+      <w:r>
+        <w:rPr>
+          <w:rFonts w:ascii="Arial" w:cs="Arial" w:eastAsia="Arial" w:hAnsi="Arial"/>
+          <w:b/>
+          <w:bCs/>
+          <w:i w:val="false"/>
+          <w:iCs w:val="false"/>
+          <w:color w:val="000000"/>
+          <w:sz w:val="20"/>
+          <w:szCs w:val="20"/>
+        </w:rPr>
+        <w:t xml:space="preserve">Customer detail tabs:</w:t>
       </w:r>
     </w:p>
     <w:p>
@@ -554,7 +1171,7 @@
           <w:sz w:val="20"/>
           <w:szCs w:val="20"/>
         </w:rPr>
-        <w:t xml:space="preserve">Web app: Open Chrome or Edge and navigate to your RouteFlow URL (provided by your administrator)</w:t>
+        <w:t xml:space="preserve">Profile — contact and address information</w:t>
       </w:r>
     </w:p>
     <w:p>
@@ -573,7 +1190,7 @@
           <w:sz w:val="20"/>
           <w:szCs w:val="20"/>
         </w:rPr>
-        <w:t xml:space="preserve">Optimal display: 1440px width or wider for the operator interface</w:t>
+        <w:t xml:space="preserve">Orders — all orders for this customer</w:t>
       </w:r>
     </w:p>
     <w:p>
@@ -592,7 +1209,7 @@
           <w:sz w:val="20"/>
           <w:szCs w:val="20"/>
         </w:rPr>
-        <w:t xml:space="preserve">Driver app: Install the RouteFlow Driver app from the App Store or Google Play; log in with your company code and credentials</w:t>
+        <w:t xml:space="preserve">Addresses — delivery addresses</w:t>
       </w:r>
     </w:p>
     <w:p>
@@ -611,7 +1228,83 @@
           <w:sz w:val="20"/>
           <w:szCs w:val="20"/>
         </w:rPr>
-        <w:t xml:space="preserve">Mobile web: Supported on Safari (iOS) and Chrome (Android) at 390px width</w:t>
+        <w:t xml:space="preserve">Standing Orders — recurring order templates</w:t>
+      </w:r>
+    </w:p>
+    <w:p>
+      <w:pPr>
+        <w:pStyle w:val="ListParagraph"/>
+        <w:numPr>
+          <w:ilvl w:val="0"/>
+          <w:numId w:val="2"/>
+        </w:numPr>
+      </w:pPr>
+      <w:r>
+        <w:rPr>
+          <w:rFonts w:ascii="Arial" w:cs="Arial" w:eastAsia="Arial" w:hAnsi="Arial"/>
+          <w:b w:val="false"/>
+          <w:bCs w:val="false"/>
+          <w:sz w:val="20"/>
+          <w:szCs w:val="20"/>
+        </w:rPr>
+        <w:t xml:space="preserve">Invoices — all invoices for this customer</w:t>
+      </w:r>
+    </w:p>
+    <w:p>
+      <w:pPr>
+        <w:pStyle w:val="ListParagraph"/>
+        <w:numPr>
+          <w:ilvl w:val="0"/>
+          <w:numId w:val="2"/>
+        </w:numPr>
+      </w:pPr>
+      <w:r>
+        <w:rPr>
+          <w:rFonts w:ascii="Arial" w:cs="Arial" w:eastAsia="Arial" w:hAnsi="Arial"/>
+          <w:b w:val="false"/>
+          <w:bCs w:val="false"/>
+          <w:sz w:val="20"/>
+          <w:szCs w:val="20"/>
+        </w:rPr>
+        <w:t xml:space="preserve">Billing — ledger, advance payments, and statement</w:t>
+      </w:r>
+    </w:p>
+    <w:p>
+      <w:pPr>
+        <w:pStyle w:val="ListParagraph"/>
+        <w:numPr>
+          <w:ilvl w:val="0"/>
+          <w:numId w:val="2"/>
+        </w:numPr>
+      </w:pPr>
+      <w:r>
+        <w:rPr>
+          <w:rFonts w:ascii="Arial" w:cs="Arial" w:eastAsia="Arial" w:hAnsi="Arial"/>
+          <w:b w:val="false"/>
+          <w:bCs w:val="false"/>
+          <w:sz w:val="20"/>
+          <w:szCs w:val="20"/>
+        </w:rPr>
+        <w:t xml:space="preserve">Special Prices — customer-specific product pricing</w:t>
+      </w:r>
+    </w:p>
+    <w:p>
+      <w:pPr>
+        <w:pStyle w:val="ListParagraph"/>
+        <w:numPr>
+          <w:ilvl w:val="0"/>
+          <w:numId w:val="2"/>
+        </w:numPr>
+      </w:pPr>
+      <w:r>
+        <w:rPr>
+          <w:rFonts w:ascii="Arial" w:cs="Arial" w:eastAsia="Arial" w:hAnsi="Arial"/>
+          <w:b w:val="false"/>
+          <w:bCs w:val="false"/>
+          <w:sz w:val="20"/>
+          <w:szCs w:val="20"/>
+        </w:rPr>
+        <w:t xml:space="preserve">Comments — internal notes</w:t>
       </w:r>
     </w:p>
     <w:p>
@@ -622,46 +1315,6 @@
           <w:szCs w:val="20"/>
         </w:rPr>
         <w:t xml:space="preserve"/>
-      </w:r>
-    </w:p>
-    <w:p>
-      <w:pPr>
-        <w:pStyle w:val="Heading1"/>
-      </w:pPr>
-      <w:r>
-        <w:rPr>
-          <w:rFonts w:ascii="Arial" w:cs="Arial" w:eastAsia="Arial" w:hAnsi="Arial"/>
-          <w:b/>
-          <w:bCs/>
-          <w:sz w:val="32"/>
-          <w:szCs w:val="32"/>
-        </w:rPr>
-        <w:t xml:space="preserve">PART 2 — GETTING STARTED</w:t>
-      </w:r>
-    </w:p>
-    <w:p>
-      <w:r>
-        <w:rPr>
-          <w:rFonts w:ascii="Arial" w:cs="Arial" w:eastAsia="Arial" w:hAnsi="Arial"/>
-          <w:sz w:val="20"/>
-          <w:szCs w:val="20"/>
-        </w:rPr>
-        <w:t xml:space="preserve"/>
-      </w:r>
-    </w:p>
-    <w:p>
-      <w:pPr>
-        <w:pStyle w:val="Heading2"/>
-      </w:pPr>
-      <w:r>
-        <w:rPr>
-          <w:rFonts w:ascii="Arial" w:cs="Arial" w:eastAsia="Arial" w:hAnsi="Arial"/>
-          <w:b/>
-          <w:bCs/>
-          <w:sz w:val="26"/>
-          <w:szCs w:val="26"/>
-        </w:rPr>
-        <w:t xml:space="preserve">2.1 Logging In</w:t>
       </w:r>
     </w:p>
     <w:p>
@@ -680,7 +1333,7 @@
           <w:sz w:val="20"/>
           <w:szCs w:val="20"/>
         </w:rPr>
-        <w:t xml:space="preserve">Navigate to your RouteFlow URL. Enter your username and password. Press Enter on the username field to move to the password field, or press Enter on the password field to submit. Click Sign In. If your organization has Google OAuth configured, a "Sign in with Google" button will also appear.</w:t>
+        <w:t xml:space="preserve">Deactivating a customer: Toggle the status switch. Inactive customers cannot be selected for new orders or routes.</w:t>
       </w:r>
     </w:p>
     <w:p>
@@ -691,49 +1344,6 @@
           <w:szCs w:val="20"/>
         </w:rPr>
         <w:t xml:space="preserve"/>
-      </w:r>
-    </w:p>
-    <w:p>
-      <w:pPr>
-        <w:spacing w:after="80" w:before="80"/>
-      </w:pPr>
-      <w:r>
-        <w:rPr>
-          <w:rFonts w:ascii="Arial" w:cs="Arial" w:eastAsia="Arial" w:hAnsi="Arial"/>
-          <w:b/>
-          <w:bCs/>
-          <w:i/>
-          <w:iCs/>
-          <w:color w:val="666666"/>
-          <w:sz w:val="20"/>
-          <w:szCs w:val="20"/>
-        </w:rPr>
-        <w:t xml:space="preserve">[SCREENSHOT: 2.1-login-page.png]</w:t>
-      </w:r>
-    </w:p>
-    <w:p>
-      <w:r>
-        <w:rPr>
-          <w:rFonts w:ascii="Arial" w:cs="Arial" w:eastAsia="Arial" w:hAnsi="Arial"/>
-          <w:sz w:val="20"/>
-          <w:szCs w:val="20"/>
-        </w:rPr>
-        <w:t xml:space="preserve"/>
-      </w:r>
-    </w:p>
-    <w:p>
-      <w:pPr>
-        <w:pStyle w:val="Heading2"/>
-      </w:pPr>
-      <w:r>
-        <w:rPr>
-          <w:rFonts w:ascii="Arial" w:cs="Arial" w:eastAsia="Arial" w:hAnsi="Arial"/>
-          <w:b/>
-          <w:bCs/>
-          <w:sz w:val="26"/>
-          <w:szCs w:val="26"/>
-        </w:rPr>
-        <w:t xml:space="preserve">2.2 Password Reset</w:t>
       </w:r>
     </w:p>
     <w:p>
@@ -752,7 +1362,7 @@
           <w:sz w:val="20"/>
           <w:szCs w:val="20"/>
         </w:rPr>
-        <w:t xml:space="preserve">Passwords are managed by your account administrator. If you forget your password, contact your administrator — they can issue a temporary password from Settings → Team. On your next login, the system will require you to set a new password before you can proceed. If your organization has Google OAuth enabled, you can log in with your Google account without a password.</w:t>
+        <w:t xml:space="preserve">Bulk actions: Import customers via CSV (Zoho format supported), export to CSV, and merge duplicate records.</w:t>
       </w:r>
     </w:p>
     <w:p>
@@ -767,20 +1377,131 @@
     </w:p>
     <w:p>
       <w:pPr>
-        <w:spacing w:after="80" w:before="80"/>
-      </w:pPr>
-      <w:r>
-        <w:rPr>
-          <w:rFonts w:ascii="Arial" w:cs="Arial" w:eastAsia="Arial" w:hAnsi="Arial"/>
-          <w:b/>
-          <w:bCs/>
-          <w:i/>
-          <w:iCs/>
-          <w:color w:val="666666"/>
-          <w:sz w:val="20"/>
-          <w:szCs w:val="20"/>
-        </w:rPr>
-        <w:t xml:space="preserve">[SCREENSHOT: 2.2-force-password-change.png]</w:t>
+        <w:jc w:val="center"/>
+        <w:spacing w:after="120" w:before="60"/>
+      </w:pPr>
+      <w:r>
+        <w:drawing>
+          <wp:inline distT="0" distB="0" distL="0" distR="0">
+            <wp:extent cx="5943600" cy="3714750"/>
+            <wp:effectExtent l="0" t="0" r="0" b="0"/>
+            <wp:docPr id="6" name="3_1-customer-list_png" descr="3.1-customer-list.png"/>
+            <wp:cNvGraphicFramePr>
+              <a:graphicFrameLocks xmlns:a="http://schemas.openxmlformats.org/drawingml/2006/main" noChangeAspect="1"/>
+            </wp:cNvGraphicFramePr>
+            <a:graphic xmlns:a="http://schemas.openxmlformats.org/drawingml/2006/main">
+              <a:graphicData uri="http://schemas.openxmlformats.org/drawingml/2006/picture">
+                <pic:pic xmlns:pic="http://schemas.openxmlformats.org/drawingml/2006/picture">
+                  <pic:nvPicPr>
+                    <pic:cNvPr id="6" name="3_1-customer-list_png"/>
+                    <pic:cNvPicPr/>
+                  </pic:nvPicPr>
+                  <pic:blipFill>
+                    <a:blip r:embed="rId16"/>
+                    <a:stretch>
+                      <a:fillRect/>
+                    </a:stretch>
+                  </pic:blipFill>
+                  <pic:spPr>
+                    <a:xfrm>
+                      <a:off x="0" y="0"/>
+                      <a:ext cx="5943600" cy="3714750"/>
+                    </a:xfrm>
+                    <a:prstGeom prst="rect">
+                      <a:avLst/>
+                    </a:prstGeom>
+                  </pic:spPr>
+                </pic:pic>
+              </a:graphicData>
+            </a:graphic>
+          </wp:inline>
+        </w:drawing>
+      </w:r>
+    </w:p>
+    <w:p>
+      <w:pPr>
+        <w:jc w:val="center"/>
+        <w:spacing w:after="120" w:before="60"/>
+      </w:pPr>
+      <w:r>
+        <w:drawing>
+          <wp:inline distT="0" distB="0" distL="0" distR="0">
+            <wp:extent cx="5943600" cy="3714750"/>
+            <wp:effectExtent l="0" t="0" r="0" b="0"/>
+            <wp:docPr id="7" name="3_1-new-customer-form_png" descr="3.1-new-customer-form.png"/>
+            <wp:cNvGraphicFramePr>
+              <a:graphicFrameLocks xmlns:a="http://schemas.openxmlformats.org/drawingml/2006/main" noChangeAspect="1"/>
+            </wp:cNvGraphicFramePr>
+            <a:graphic xmlns:a="http://schemas.openxmlformats.org/drawingml/2006/main">
+              <a:graphicData uri="http://schemas.openxmlformats.org/drawingml/2006/picture">
+                <pic:pic xmlns:pic="http://schemas.openxmlformats.org/drawingml/2006/picture">
+                  <pic:nvPicPr>
+                    <pic:cNvPr id="7" name="3_1-new-customer-form_png"/>
+                    <pic:cNvPicPr/>
+                  </pic:nvPicPr>
+                  <pic:blipFill>
+                    <a:blip r:embed="rId17"/>
+                    <a:stretch>
+                      <a:fillRect/>
+                    </a:stretch>
+                  </pic:blipFill>
+                  <pic:spPr>
+                    <a:xfrm>
+                      <a:off x="0" y="0"/>
+                      <a:ext cx="5943600" cy="3714750"/>
+                    </a:xfrm>
+                    <a:prstGeom prst="rect">
+                      <a:avLst/>
+                    </a:prstGeom>
+                  </pic:spPr>
+                </pic:pic>
+              </a:graphicData>
+            </a:graphic>
+          </wp:inline>
+        </w:drawing>
+      </w:r>
+    </w:p>
+    <w:p>
+      <w:pPr>
+        <w:jc w:val="center"/>
+        <w:spacing w:after="120" w:before="60"/>
+      </w:pPr>
+      <w:r>
+        <w:drawing>
+          <wp:inline distT="0" distB="0" distL="0" distR="0">
+            <wp:extent cx="5943600" cy="3714750"/>
+            <wp:effectExtent l="0" t="0" r="0" b="0"/>
+            <wp:docPr id="8" name="3_1-customer-detail_png" descr="3.1-customer-detail.png"/>
+            <wp:cNvGraphicFramePr>
+              <a:graphicFrameLocks xmlns:a="http://schemas.openxmlformats.org/drawingml/2006/main" noChangeAspect="1"/>
+            </wp:cNvGraphicFramePr>
+            <a:graphic xmlns:a="http://schemas.openxmlformats.org/drawingml/2006/main">
+              <a:graphicData uri="http://schemas.openxmlformats.org/drawingml/2006/picture">
+                <pic:pic xmlns:pic="http://schemas.openxmlformats.org/drawingml/2006/picture">
+                  <pic:nvPicPr>
+                    <pic:cNvPr id="8" name="3_1-customer-detail_png"/>
+                    <pic:cNvPicPr/>
+                  </pic:nvPicPr>
+                  <pic:blipFill>
+                    <a:blip r:embed="rId15"/>
+                    <a:stretch>
+                      <a:fillRect/>
+                    </a:stretch>
+                  </pic:blipFill>
+                  <pic:spPr>
+                    <a:xfrm>
+                      <a:off x="0" y="0"/>
+                      <a:ext cx="5943600" cy="3714750"/>
+                    </a:xfrm>
+                    <a:prstGeom prst="rect">
+                      <a:avLst/>
+                    </a:prstGeom>
+                  </pic:spPr>
+                </pic:pic>
+              </a:graphicData>
+            </a:graphic>
+          </wp:inline>
+        </w:drawing>
       </w:r>
     </w:p>
     <w:p>
@@ -805,7 +1526,7 @@
           <w:sz w:val="26"/>
           <w:szCs w:val="26"/>
         </w:rPr>
-        <w:t xml:space="preserve">2.3 Your Dashboard</w:t>
+        <w:t xml:space="preserve">3.2 Supplier Management</w:t>
       </w:r>
     </w:p>
     <w:p>
@@ -824,7 +1545,7 @@
           <w:sz w:val="20"/>
           <w:szCs w:val="20"/>
         </w:rPr>
-        <w:t xml:space="preserve">After logging in, you are taken to your role-specific dashboard:</w:t>
+        <w:t xml:space="preserve">Create a supplier with company name, contact person, phone, mobile, email, lead time (days), address, and notes. Link suppliers to products via purchase orders. Deactivate a supplier when no longer in use — this preserves historical purchase order data.</w:t>
       </w:r>
     </w:p>
     <w:p>
@@ -839,787 +1560,45 @@
     </w:p>
     <w:p>
       <w:pPr>
-        <w:spacing w:after="60" w:before="60"/>
-      </w:pPr>
-      <w:r>
-        <w:rPr>
-          <w:rFonts w:ascii="Arial" w:cs="Arial" w:eastAsia="Arial" w:hAnsi="Arial"/>
-          <w:b/>
-          <w:bCs/>
-          <w:sz w:val="20"/>
-          <w:szCs w:val="20"/>
-        </w:rPr>
-        <w:t xml:space="preserve">Operator Dashboard: </w:t>
-      </w:r>
-      <w:r>
-        <w:rPr>
-          <w:rFonts w:ascii="Arial" w:cs="Arial" w:eastAsia="Arial" w:hAnsi="Arial"/>
-          <w:sz w:val="20"/>
-          <w:szCs w:val="20"/>
-        </w:rPr>
-        <w:t xml:space="preserve">KPI cards showing orders by status, revenue totals, overdue invoices, and low-stock products. Below the cards: an active routes table and a recent orders table.</w:t>
-      </w:r>
-    </w:p>
-    <w:p>
-      <w:r>
-        <w:rPr>
-          <w:rFonts w:ascii="Arial" w:cs="Arial" w:eastAsia="Arial" w:hAnsi="Arial"/>
-          <w:sz w:val="20"/>
-          <w:szCs w:val="20"/>
-        </w:rPr>
-        <w:t xml:space="preserve"/>
-      </w:r>
-    </w:p>
-    <w:p>
-      <w:pPr>
-        <w:spacing w:after="60" w:before="60"/>
-      </w:pPr>
-      <w:r>
-        <w:rPr>
-          <w:rFonts w:ascii="Arial" w:cs="Arial" w:eastAsia="Arial" w:hAnsi="Arial"/>
-          <w:b/>
-          <w:bCs/>
-          <w:sz w:val="20"/>
-          <w:szCs w:val="20"/>
-        </w:rPr>
-        <w:t xml:space="preserve">Driver Dashboard (mobile): </w:t>
-      </w:r>
-      <w:r>
-        <w:rPr>
-          <w:rFonts w:ascii="Arial" w:cs="Arial" w:eastAsia="Arial" w:hAnsi="Arial"/>
-          <w:sz w:val="20"/>
-          <w:szCs w:val="20"/>
-        </w:rPr>
-        <w:t xml:space="preserve">Your assigned routes for today, with stop count and scheduled time for each.</w:t>
-      </w:r>
-    </w:p>
-    <w:p>
-      <w:r>
-        <w:rPr>
-          <w:rFonts w:ascii="Arial" w:cs="Arial" w:eastAsia="Arial" w:hAnsi="Arial"/>
-          <w:sz w:val="20"/>
-          <w:szCs w:val="20"/>
-        </w:rPr>
-        <w:t xml:space="preserve"/>
-      </w:r>
-    </w:p>
-    <w:p>
-      <w:pPr>
-        <w:spacing w:after="60" w:before="60"/>
-      </w:pPr>
-      <w:r>
-        <w:rPr>
-          <w:rFonts w:ascii="Arial" w:cs="Arial" w:eastAsia="Arial" w:hAnsi="Arial"/>
-          <w:b/>
-          <w:bCs/>
-          <w:sz w:val="20"/>
-          <w:szCs w:val="20"/>
-        </w:rPr>
-        <w:t xml:space="preserve">Customer Dashboard: </w:t>
-      </w:r>
-      <w:r>
-        <w:rPr>
-          <w:rFonts w:ascii="Arial" w:cs="Arial" w:eastAsia="Arial" w:hAnsi="Arial"/>
-          <w:sz w:val="20"/>
-          <w:szCs w:val="20"/>
-        </w:rPr>
-        <w:t xml:space="preserve">A quick summary of your recent orders and current account balance.</w:t>
-      </w:r>
-    </w:p>
-    <w:p>
-      <w:r>
-        <w:rPr>
-          <w:rFonts w:ascii="Arial" w:cs="Arial" w:eastAsia="Arial" w:hAnsi="Arial"/>
-          <w:sz w:val="20"/>
-          <w:szCs w:val="20"/>
-        </w:rPr>
-        <w:t xml:space="preserve"/>
-      </w:r>
-    </w:p>
-    <w:p>
-      <w:pPr>
-        <w:spacing w:after="80" w:before="80"/>
-      </w:pPr>
-      <w:r>
-        <w:rPr>
-          <w:rFonts w:ascii="Arial" w:cs="Arial" w:eastAsia="Arial" w:hAnsi="Arial"/>
-          <w:b/>
-          <w:bCs/>
-          <w:i/>
-          <w:iCs/>
-          <w:color w:val="666666"/>
-          <w:sz w:val="20"/>
-          <w:szCs w:val="20"/>
-        </w:rPr>
-        <w:t xml:space="preserve">[SCREENSHOT: 2.3-operator-dashboard.png]</w:t>
-      </w:r>
-    </w:p>
-    <w:p>
-      <w:pPr>
-        <w:spacing w:after="80" w:before="80"/>
-      </w:pPr>
-      <w:r>
-        <w:rPr>
-          <w:rFonts w:ascii="Arial" w:cs="Arial" w:eastAsia="Arial" w:hAnsi="Arial"/>
-          <w:b/>
-          <w:bCs/>
-          <w:i/>
-          <w:iCs/>
-          <w:color w:val="666666"/>
-          <w:sz w:val="20"/>
-          <w:szCs w:val="20"/>
-        </w:rPr>
-        <w:t xml:space="preserve">[SCREENSHOT: 2.3-driver-dashboard-mobile.png]</w:t>
-      </w:r>
-    </w:p>
-    <w:p>
-      <w:pPr>
-        <w:spacing w:after="80" w:before="80"/>
-      </w:pPr>
-      <w:r>
-        <w:rPr>
-          <w:rFonts w:ascii="Arial" w:cs="Arial" w:eastAsia="Arial" w:hAnsi="Arial"/>
-          <w:b/>
-          <w:bCs/>
-          <w:i/>
-          <w:iCs/>
-          <w:color w:val="666666"/>
-          <w:sz w:val="20"/>
-          <w:szCs w:val="20"/>
-        </w:rPr>
-        <w:t xml:space="preserve">[SCREENSHOT: 2.3-customer-dashboard.png]</w:t>
-      </w:r>
-    </w:p>
-    <w:p>
-      <w:r>
-        <w:rPr>
-          <w:rFonts w:ascii="Arial" w:cs="Arial" w:eastAsia="Arial" w:hAnsi="Arial"/>
-          <w:sz w:val="20"/>
-          <w:szCs w:val="20"/>
-        </w:rPr>
-        <w:t xml:space="preserve"/>
-      </w:r>
-    </w:p>
-    <w:p>
-      <w:pPr>
-        <w:pStyle w:val="Heading2"/>
-      </w:pPr>
-      <w:r>
-        <w:rPr>
-          <w:rFonts w:ascii="Arial" w:cs="Arial" w:eastAsia="Arial" w:hAnsi="Arial"/>
-          <w:b/>
-          <w:bCs/>
-          <w:sz w:val="26"/>
-          <w:szCs w:val="26"/>
-        </w:rPr>
-        <w:t xml:space="preserve">2.4 Navigation</w:t>
-      </w:r>
-    </w:p>
-    <w:p>
-      <w:pPr>
-        <w:spacing w:after="80" w:before="0"/>
-        <w:jc w:val="left"/>
-      </w:pPr>
-      <w:r>
-        <w:rPr>
-          <w:rFonts w:ascii="Arial" w:cs="Arial" w:eastAsia="Arial" w:hAnsi="Arial"/>
-          <w:b w:val="false"/>
-          <w:bCs w:val="false"/>
-          <w:i w:val="false"/>
-          <w:iCs w:val="false"/>
-          <w:color w:val="000000"/>
-          <w:sz w:val="20"/>
-          <w:szCs w:val="20"/>
-        </w:rPr>
-        <w:t xml:space="preserve">Operator/Admin: A collapsible sidebar on the left shows all modules: Dashboard, Customers, Orders, Returns, Routes, Drivers, Products, Inventory, Suppliers, Invoices, Estimates, Credit Notes, Finance, Analytics, Settings. Collapse to icon-only mode using the arrow button.</w:t>
-      </w:r>
-    </w:p>
-    <w:p>
-      <w:r>
-        <w:rPr>
-          <w:rFonts w:ascii="Arial" w:cs="Arial" w:eastAsia="Arial" w:hAnsi="Arial"/>
-          <w:sz w:val="20"/>
-          <w:szCs w:val="20"/>
-        </w:rPr>
-        <w:t xml:space="preserve"/>
-      </w:r>
-    </w:p>
-    <w:p>
-      <w:pPr>
-        <w:spacing w:after="80" w:before="0"/>
-        <w:jc w:val="left"/>
-      </w:pPr>
-      <w:r>
-        <w:rPr>
-          <w:rFonts w:ascii="Arial" w:cs="Arial" w:eastAsia="Arial" w:hAnsi="Arial"/>
-          <w:b w:val="false"/>
-          <w:bCs w:val="false"/>
-          <w:i w:val="false"/>
-          <w:iCs w:val="false"/>
-          <w:color w:val="000000"/>
-          <w:sz w:val="20"/>
-          <w:szCs w:val="20"/>
-        </w:rPr>
-        <w:t xml:space="preserve">Customer: Left sidebar shows Dashboard, Orders, Returns, Invoices, Settings only.</w:t>
-      </w:r>
-    </w:p>
-    <w:p>
-      <w:r>
-        <w:rPr>
-          <w:rFonts w:ascii="Arial" w:cs="Arial" w:eastAsia="Arial" w:hAnsi="Arial"/>
-          <w:sz w:val="20"/>
-          <w:szCs w:val="20"/>
-        </w:rPr>
-        <w:t xml:space="preserve"/>
-      </w:r>
-    </w:p>
-    <w:p>
-      <w:pPr>
-        <w:spacing w:after="80" w:before="0"/>
-        <w:jc w:val="left"/>
-      </w:pPr>
-      <w:r>
-        <w:rPr>
-          <w:rFonts w:ascii="Arial" w:cs="Arial" w:eastAsia="Arial" w:hAnsi="Arial"/>
-          <w:b w:val="false"/>
-          <w:bCs w:val="false"/>
-          <w:i w:val="false"/>
-          <w:iCs w:val="false"/>
-          <w:color w:val="000000"/>
-          <w:sz w:val="20"/>
-          <w:szCs w:val="20"/>
-        </w:rPr>
-        <w:t xml:space="preserve">Driver (mobile): Bottom tab bar shows Dashboard, My Routes, Settings.</w:t>
-      </w:r>
-    </w:p>
-    <w:p>
-      <w:r>
-        <w:rPr>
-          <w:rFonts w:ascii="Arial" w:cs="Arial" w:eastAsia="Arial" w:hAnsi="Arial"/>
-          <w:sz w:val="20"/>
-          <w:szCs w:val="20"/>
-        </w:rPr>
-        <w:t xml:space="preserve"/>
-      </w:r>
-    </w:p>
-    <w:p>
-      <w:pPr>
-        <w:spacing w:after="80" w:before="0"/>
-        <w:jc w:val="left"/>
-      </w:pPr>
-      <w:r>
-        <w:rPr>
-          <w:rFonts w:ascii="Arial" w:cs="Arial" w:eastAsia="Arial" w:hAnsi="Arial"/>
-          <w:b w:val="false"/>
-          <w:bCs w:val="false"/>
-          <w:i w:val="false"/>
-          <w:iCs w:val="false"/>
-          <w:color w:val="000000"/>
-          <w:sz w:val="20"/>
-          <w:szCs w:val="20"/>
-        </w:rPr>
-        <w:t xml:space="preserve">The notification bell (top right, web) shows an unread count. Click to see recent notifications. Your user avatar (top right) opens a dropdown with profile and logout options.</w:t>
-      </w:r>
-    </w:p>
-    <w:p>
-      <w:r>
-        <w:rPr>
-          <w:rFonts w:ascii="Arial" w:cs="Arial" w:eastAsia="Arial" w:hAnsi="Arial"/>
-          <w:sz w:val="20"/>
-          <w:szCs w:val="20"/>
-        </w:rPr>
-        <w:t xml:space="preserve"/>
-      </w:r>
-    </w:p>
-    <w:p>
-      <w:pPr>
-        <w:spacing w:after="80" w:before="80"/>
-      </w:pPr>
-      <w:r>
-        <w:rPr>
-          <w:rFonts w:ascii="Arial" w:cs="Arial" w:eastAsia="Arial" w:hAnsi="Arial"/>
-          <w:b/>
-          <w:bCs/>
-          <w:i/>
-          <w:iCs/>
-          <w:color w:val="666666"/>
-          <w:sz w:val="20"/>
-          <w:szCs w:val="20"/>
-        </w:rPr>
-        <w:t xml:space="preserve">[SCREENSHOT: 2.4-operator-navigation.png]</w:t>
-      </w:r>
-    </w:p>
-    <w:p>
-      <w:r>
-        <w:rPr>
-          <w:rFonts w:ascii="Arial" w:cs="Arial" w:eastAsia="Arial" w:hAnsi="Arial"/>
-          <w:sz w:val="20"/>
-          <w:szCs w:val="20"/>
-        </w:rPr>
-        <w:t xml:space="preserve"/>
-      </w:r>
-    </w:p>
-    <w:p>
-      <w:pPr>
-        <w:pStyle w:val="Heading1"/>
-      </w:pPr>
-      <w:r>
-        <w:rPr>
-          <w:rFonts w:ascii="Arial" w:cs="Arial" w:eastAsia="Arial" w:hAnsi="Arial"/>
-          <w:b/>
-          <w:bCs/>
-          <w:sz w:val="32"/>
-          <w:szCs w:val="32"/>
-        </w:rPr>
-        <w:t xml:space="preserve">PART 3 — OPERATOR GUIDE</w:t>
-      </w:r>
-    </w:p>
-    <w:p>
-      <w:r>
-        <w:rPr>
-          <w:rFonts w:ascii="Arial" w:cs="Arial" w:eastAsia="Arial" w:hAnsi="Arial"/>
-          <w:sz w:val="20"/>
-          <w:szCs w:val="20"/>
-        </w:rPr>
-        <w:t xml:space="preserve"/>
-      </w:r>
-    </w:p>
-    <w:p>
-      <w:pPr>
-        <w:pStyle w:val="Heading2"/>
-      </w:pPr>
-      <w:r>
-        <w:rPr>
-          <w:rFonts w:ascii="Arial" w:cs="Arial" w:eastAsia="Arial" w:hAnsi="Arial"/>
-          <w:b/>
-          <w:bCs/>
-          <w:sz w:val="26"/>
-          <w:szCs w:val="26"/>
-        </w:rPr>
-        <w:t xml:space="preserve">3.1 Customer Management</w:t>
-      </w:r>
-    </w:p>
-    <w:p>
-      <w:pPr>
-        <w:spacing w:after="80" w:before="0"/>
-        <w:jc w:val="left"/>
-      </w:pPr>
-      <w:r>
-        <w:rPr>
-          <w:rFonts w:ascii="Arial" w:cs="Arial" w:eastAsia="Arial" w:hAnsi="Arial"/>
-          <w:b w:val="false"/>
-          <w:bCs w:val="false"/>
-          <w:i w:val="false"/>
-          <w:iCs w:val="false"/>
-          <w:color w:val="000000"/>
-          <w:sz w:val="20"/>
-          <w:szCs w:val="20"/>
-        </w:rPr>
-        <w:t xml:space="preserve">Customer list: Search by business name, contact name, email, or phone. Filter by status (Active / Inactive). The list shows receivable balances and available credit for each customer.</w:t>
-      </w:r>
-    </w:p>
-    <w:p>
-      <w:r>
-        <w:rPr>
-          <w:rFonts w:ascii="Arial" w:cs="Arial" w:eastAsia="Arial" w:hAnsi="Arial"/>
-          <w:sz w:val="20"/>
-          <w:szCs w:val="20"/>
-        </w:rPr>
-        <w:t xml:space="preserve"/>
-      </w:r>
-    </w:p>
-    <w:p>
-      <w:pPr>
-        <w:spacing w:after="80" w:before="0"/>
-        <w:jc w:val="left"/>
-      </w:pPr>
-      <w:r>
-        <w:rPr>
-          <w:rFonts w:ascii="Arial" w:cs="Arial" w:eastAsia="Arial" w:hAnsi="Arial"/>
-          <w:b w:val="false"/>
-          <w:bCs w:val="false"/>
-          <w:i w:val="false"/>
-          <w:iCs w:val="false"/>
-          <w:color w:val="000000"/>
-          <w:sz w:val="20"/>
-          <w:szCs w:val="20"/>
-        </w:rPr>
-        <w:t xml:space="preserve">Create / edit customer: Fill in business name, contact name, email, phone, billing address (with autocomplete suggestions), customer type, tax ID, payment terms, credit limit, and optional tags.</w:t>
-      </w:r>
-    </w:p>
-    <w:p>
-      <w:r>
-        <w:rPr>
-          <w:rFonts w:ascii="Arial" w:cs="Arial" w:eastAsia="Arial" w:hAnsi="Arial"/>
-          <w:sz w:val="20"/>
-          <w:szCs w:val="20"/>
-        </w:rPr>
-        <w:t xml:space="preserve"/>
-      </w:r>
-    </w:p>
-    <w:p>
-      <w:pPr>
-        <w:spacing w:after="80" w:before="0"/>
-        <w:jc w:val="left"/>
-      </w:pPr>
-      <w:r>
-        <w:rPr>
-          <w:rFonts w:ascii="Arial" w:cs="Arial" w:eastAsia="Arial" w:hAnsi="Arial"/>
-          <w:b/>
-          <w:bCs/>
-          <w:i w:val="false"/>
-          <w:iCs w:val="false"/>
-          <w:color w:val="000000"/>
-          <w:sz w:val="20"/>
-          <w:szCs w:val="20"/>
-        </w:rPr>
-        <w:t xml:space="preserve">Customer detail tabs:</w:t>
-      </w:r>
-    </w:p>
-    <w:p>
-      <w:pPr>
-        <w:pStyle w:val="ListParagraph"/>
-        <w:numPr>
-          <w:ilvl w:val="0"/>
-          <w:numId w:val="2"/>
-        </w:numPr>
-      </w:pPr>
-      <w:r>
-        <w:rPr>
-          <w:rFonts w:ascii="Arial" w:cs="Arial" w:eastAsia="Arial" w:hAnsi="Arial"/>
-          <w:b w:val="false"/>
-          <w:bCs w:val="false"/>
-          <w:sz w:val="20"/>
-          <w:szCs w:val="20"/>
-        </w:rPr>
-        <w:t xml:space="preserve">Profile — contact and address information</w:t>
-      </w:r>
-    </w:p>
-    <w:p>
-      <w:pPr>
-        <w:pStyle w:val="ListParagraph"/>
-        <w:numPr>
-          <w:ilvl w:val="0"/>
-          <w:numId w:val="2"/>
-        </w:numPr>
-      </w:pPr>
-      <w:r>
-        <w:rPr>
-          <w:rFonts w:ascii="Arial" w:cs="Arial" w:eastAsia="Arial" w:hAnsi="Arial"/>
-          <w:b w:val="false"/>
-          <w:bCs w:val="false"/>
-          <w:sz w:val="20"/>
-          <w:szCs w:val="20"/>
-        </w:rPr>
-        <w:t xml:space="preserve">Orders — all orders for this customer</w:t>
-      </w:r>
-    </w:p>
-    <w:p>
-      <w:pPr>
-        <w:pStyle w:val="ListParagraph"/>
-        <w:numPr>
-          <w:ilvl w:val="0"/>
-          <w:numId w:val="2"/>
-        </w:numPr>
-      </w:pPr>
-      <w:r>
-        <w:rPr>
-          <w:rFonts w:ascii="Arial" w:cs="Arial" w:eastAsia="Arial" w:hAnsi="Arial"/>
-          <w:b w:val="false"/>
-          <w:bCs w:val="false"/>
-          <w:sz w:val="20"/>
-          <w:szCs w:val="20"/>
-        </w:rPr>
-        <w:t xml:space="preserve">Addresses — delivery addresses</w:t>
-      </w:r>
-    </w:p>
-    <w:p>
-      <w:pPr>
-        <w:pStyle w:val="ListParagraph"/>
-        <w:numPr>
-          <w:ilvl w:val="0"/>
-          <w:numId w:val="2"/>
-        </w:numPr>
-      </w:pPr>
-      <w:r>
-        <w:rPr>
-          <w:rFonts w:ascii="Arial" w:cs="Arial" w:eastAsia="Arial" w:hAnsi="Arial"/>
-          <w:b w:val="false"/>
-          <w:bCs w:val="false"/>
-          <w:sz w:val="20"/>
-          <w:szCs w:val="20"/>
-        </w:rPr>
-        <w:t xml:space="preserve">Standing Orders — recurring order templates</w:t>
-      </w:r>
-    </w:p>
-    <w:p>
-      <w:pPr>
-        <w:pStyle w:val="ListParagraph"/>
-        <w:numPr>
-          <w:ilvl w:val="0"/>
-          <w:numId w:val="2"/>
-        </w:numPr>
-      </w:pPr>
-      <w:r>
-        <w:rPr>
-          <w:rFonts w:ascii="Arial" w:cs="Arial" w:eastAsia="Arial" w:hAnsi="Arial"/>
-          <w:b w:val="false"/>
-          <w:bCs w:val="false"/>
-          <w:sz w:val="20"/>
-          <w:szCs w:val="20"/>
-        </w:rPr>
-        <w:t xml:space="preserve">Invoices — all invoices for this customer</w:t>
-      </w:r>
-    </w:p>
-    <w:p>
-      <w:pPr>
-        <w:pStyle w:val="ListParagraph"/>
-        <w:numPr>
-          <w:ilvl w:val="0"/>
-          <w:numId w:val="2"/>
-        </w:numPr>
-      </w:pPr>
-      <w:r>
-        <w:rPr>
-          <w:rFonts w:ascii="Arial" w:cs="Arial" w:eastAsia="Arial" w:hAnsi="Arial"/>
-          <w:b w:val="false"/>
-          <w:bCs w:val="false"/>
-          <w:sz w:val="20"/>
-          <w:szCs w:val="20"/>
-        </w:rPr>
-        <w:t xml:space="preserve">Billing — ledger, advance payments, and statement</w:t>
-      </w:r>
-    </w:p>
-    <w:p>
-      <w:pPr>
-        <w:pStyle w:val="ListParagraph"/>
-        <w:numPr>
-          <w:ilvl w:val="0"/>
-          <w:numId w:val="2"/>
-        </w:numPr>
-      </w:pPr>
-      <w:r>
-        <w:rPr>
-          <w:rFonts w:ascii="Arial" w:cs="Arial" w:eastAsia="Arial" w:hAnsi="Arial"/>
-          <w:b w:val="false"/>
-          <w:bCs w:val="false"/>
-          <w:sz w:val="20"/>
-          <w:szCs w:val="20"/>
-        </w:rPr>
-        <w:t xml:space="preserve">Special Prices — customer-specific product pricing</w:t>
-      </w:r>
-    </w:p>
-    <w:p>
-      <w:pPr>
-        <w:pStyle w:val="ListParagraph"/>
-        <w:numPr>
-          <w:ilvl w:val="0"/>
-          <w:numId w:val="2"/>
-        </w:numPr>
-      </w:pPr>
-      <w:r>
-        <w:rPr>
-          <w:rFonts w:ascii="Arial" w:cs="Arial" w:eastAsia="Arial" w:hAnsi="Arial"/>
-          <w:b w:val="false"/>
-          <w:bCs w:val="false"/>
-          <w:sz w:val="20"/>
-          <w:szCs w:val="20"/>
-        </w:rPr>
-        <w:t xml:space="preserve">Comments — internal notes</w:t>
-      </w:r>
-    </w:p>
-    <w:p>
-      <w:r>
-        <w:rPr>
-          <w:rFonts w:ascii="Arial" w:cs="Arial" w:eastAsia="Arial" w:hAnsi="Arial"/>
-          <w:sz w:val="20"/>
-          <w:szCs w:val="20"/>
-        </w:rPr>
-        <w:t xml:space="preserve"/>
-      </w:r>
-    </w:p>
-    <w:p>
-      <w:pPr>
-        <w:spacing w:after="80" w:before="0"/>
-        <w:jc w:val="left"/>
-      </w:pPr>
-      <w:r>
-        <w:rPr>
-          <w:rFonts w:ascii="Arial" w:cs="Arial" w:eastAsia="Arial" w:hAnsi="Arial"/>
-          <w:b w:val="false"/>
-          <w:bCs w:val="false"/>
-          <w:i w:val="false"/>
-          <w:iCs w:val="false"/>
-          <w:color w:val="000000"/>
-          <w:sz w:val="20"/>
-          <w:szCs w:val="20"/>
-        </w:rPr>
-        <w:t xml:space="preserve">Deactivating a customer: Toggle the status switch. Inactive customers cannot be selected for new orders or routes.</w:t>
-      </w:r>
-    </w:p>
-    <w:p>
-      <w:r>
-        <w:rPr>
-          <w:rFonts w:ascii="Arial" w:cs="Arial" w:eastAsia="Arial" w:hAnsi="Arial"/>
-          <w:sz w:val="20"/>
-          <w:szCs w:val="20"/>
-        </w:rPr>
-        <w:t xml:space="preserve"/>
-      </w:r>
-    </w:p>
-    <w:p>
-      <w:pPr>
-        <w:spacing w:after="80" w:before="0"/>
-        <w:jc w:val="left"/>
-      </w:pPr>
-      <w:r>
-        <w:rPr>
-          <w:rFonts w:ascii="Arial" w:cs="Arial" w:eastAsia="Arial" w:hAnsi="Arial"/>
-          <w:b w:val="false"/>
-          <w:bCs w:val="false"/>
-          <w:i w:val="false"/>
-          <w:iCs w:val="false"/>
-          <w:color w:val="000000"/>
-          <w:sz w:val="20"/>
-          <w:szCs w:val="20"/>
-        </w:rPr>
-        <w:t xml:space="preserve">Bulk actions: Import customers via CSV (Zoho format supported), export to CSV, and merge duplicate records.</w:t>
-      </w:r>
-    </w:p>
-    <w:p>
-      <w:r>
-        <w:rPr>
-          <w:rFonts w:ascii="Arial" w:cs="Arial" w:eastAsia="Arial" w:hAnsi="Arial"/>
-          <w:sz w:val="20"/>
-          <w:szCs w:val="20"/>
-        </w:rPr>
-        <w:t xml:space="preserve"/>
-      </w:r>
-    </w:p>
-    <w:p>
-      <w:pPr>
-        <w:spacing w:after="80" w:before="80"/>
-      </w:pPr>
-      <w:r>
-        <w:rPr>
-          <w:rFonts w:ascii="Arial" w:cs="Arial" w:eastAsia="Arial" w:hAnsi="Arial"/>
-          <w:b/>
-          <w:bCs/>
-          <w:i/>
-          <w:iCs/>
-          <w:color w:val="666666"/>
-          <w:sz w:val="20"/>
-          <w:szCs w:val="20"/>
-        </w:rPr>
-        <w:t xml:space="preserve">[SCREENSHOT: 3.1-customer-list.png]</w:t>
-      </w:r>
-    </w:p>
-    <w:p>
-      <w:pPr>
-        <w:spacing w:after="80" w:before="80"/>
-      </w:pPr>
-      <w:r>
-        <w:rPr>
-          <w:rFonts w:ascii="Arial" w:cs="Arial" w:eastAsia="Arial" w:hAnsi="Arial"/>
-          <w:b/>
-          <w:bCs/>
-          <w:i/>
-          <w:iCs/>
-          <w:color w:val="666666"/>
-          <w:sz w:val="20"/>
-          <w:szCs w:val="20"/>
-        </w:rPr>
-        <w:t xml:space="preserve">[SCREENSHOT: 3.1-new-customer-form.png]</w:t>
-      </w:r>
-    </w:p>
-    <w:p>
-      <w:pPr>
-        <w:spacing w:after="80" w:before="80"/>
-      </w:pPr>
-      <w:r>
-        <w:rPr>
-          <w:rFonts w:ascii="Arial" w:cs="Arial" w:eastAsia="Arial" w:hAnsi="Arial"/>
-          <w:b/>
-          <w:bCs/>
-          <w:i/>
-          <w:iCs/>
-          <w:color w:val="666666"/>
-          <w:sz w:val="20"/>
-          <w:szCs w:val="20"/>
-        </w:rPr>
-        <w:t xml:space="preserve">[SCREENSHOT: 3.1-customer-detail.png]</w:t>
-      </w:r>
-    </w:p>
-    <w:p>
-      <w:r>
-        <w:rPr>
-          <w:rFonts w:ascii="Arial" w:cs="Arial" w:eastAsia="Arial" w:hAnsi="Arial"/>
-          <w:sz w:val="20"/>
-          <w:szCs w:val="20"/>
-        </w:rPr>
-        <w:t xml:space="preserve"/>
-      </w:r>
-    </w:p>
-    <w:p>
-      <w:pPr>
-        <w:pStyle w:val="Heading2"/>
-      </w:pPr>
-      <w:r>
-        <w:rPr>
-          <w:rFonts w:ascii="Arial" w:cs="Arial" w:eastAsia="Arial" w:hAnsi="Arial"/>
-          <w:b/>
-          <w:bCs/>
-          <w:sz w:val="26"/>
-          <w:szCs w:val="26"/>
-        </w:rPr>
-        <w:t xml:space="preserve">3.2 Supplier Management</w:t>
-      </w:r>
-    </w:p>
-    <w:p>
-      <w:pPr>
-        <w:spacing w:after="80" w:before="0"/>
-        <w:jc w:val="left"/>
-      </w:pPr>
-      <w:r>
-        <w:rPr>
-          <w:rFonts w:ascii="Arial" w:cs="Arial" w:eastAsia="Arial" w:hAnsi="Arial"/>
-          <w:b w:val="false"/>
-          <w:bCs w:val="false"/>
-          <w:i w:val="false"/>
-          <w:iCs w:val="false"/>
-          <w:color w:val="000000"/>
-          <w:sz w:val="20"/>
-          <w:szCs w:val="20"/>
-        </w:rPr>
-        <w:t xml:space="preserve">Create a supplier with company name, contact person, phone, mobile, email, lead time (days), address, and notes. Link suppliers to products via purchase orders. Deactivate a supplier when no longer in use — this preserves historical purchase order data.</w:t>
-      </w:r>
-    </w:p>
-    <w:p>
-      <w:r>
-        <w:rPr>
-          <w:rFonts w:ascii="Arial" w:cs="Arial" w:eastAsia="Arial" w:hAnsi="Arial"/>
-          <w:sz w:val="20"/>
-          <w:szCs w:val="20"/>
-        </w:rPr>
-        <w:t xml:space="preserve"/>
-      </w:r>
-    </w:p>
-    <w:p>
-      <w:pPr>
-        <w:spacing w:after="80" w:before="80"/>
-      </w:pPr>
-      <w:r>
-        <w:rPr>
-          <w:rFonts w:ascii="Arial" w:cs="Arial" w:eastAsia="Arial" w:hAnsi="Arial"/>
-          <w:b/>
-          <w:bCs/>
-          <w:i/>
-          <w:iCs/>
-          <w:color w:val="666666"/>
-          <w:sz w:val="20"/>
-          <w:szCs w:val="20"/>
-        </w:rPr>
-        <w:t xml:space="preserve">[SCREENSHOT: 3.2-supplier-list.png]</w:t>
+        <w:jc w:val="center"/>
+        <w:spacing w:after="120" w:before="60"/>
+      </w:pPr>
+      <w:r>
+        <w:drawing>
+          <wp:inline distT="0" distB="0" distL="0" distR="0">
+            <wp:extent cx="5943600" cy="3714750"/>
+            <wp:effectExtent l="0" t="0" r="0" b="0"/>
+            <wp:docPr id="9" name="3_2-supplier-list_png" descr="3.2-supplier-list.png"/>
+            <wp:cNvGraphicFramePr>
+              <a:graphicFrameLocks xmlns:a="http://schemas.openxmlformats.org/drawingml/2006/main" noChangeAspect="1"/>
+            </wp:cNvGraphicFramePr>
+            <a:graphic xmlns:a="http://schemas.openxmlformats.org/drawingml/2006/main">
+              <a:graphicData uri="http://schemas.openxmlformats.org/drawingml/2006/picture">
+                <pic:pic xmlns:pic="http://schemas.openxmlformats.org/drawingml/2006/picture">
+                  <pic:nvPicPr>
+                    <pic:cNvPr id="9" name="3_2-supplier-list_png"/>
+                    <pic:cNvPicPr/>
+                  </pic:nvPicPr>
+                  <pic:blipFill>
+                    <a:blip r:embed="rId18"/>
+                    <a:stretch>
+                      <a:fillRect/>
+                    </a:stretch>
+                  </pic:blipFill>
+                  <pic:spPr>
+                    <a:xfrm>
+                      <a:off x="0" y="0"/>
+                      <a:ext cx="5943600" cy="3714750"/>
+                    </a:xfrm>
+                    <a:prstGeom prst="rect">
+                      <a:avLst/>
+                    </a:prstGeom>
+                  </pic:spPr>
+                </pic:pic>
+              </a:graphicData>
+            </a:graphic>
+          </wp:inline>
+        </w:drawing>
       </w:r>
     </w:p>
     <w:p>
@@ -3338,56 +3317,131 @@
     </w:p>
     <w:p>
       <w:pPr>
-        <w:spacing w:after="80" w:before="80"/>
-      </w:pPr>
-      <w:r>
-        <w:rPr>
-          <w:rFonts w:ascii="Arial" w:cs="Arial" w:eastAsia="Arial" w:hAnsi="Arial"/>
-          <w:b/>
-          <w:bCs/>
-          <w:i/>
-          <w:iCs/>
-          <w:color w:val="666666"/>
-          <w:sz w:val="20"/>
-          <w:szCs w:val="20"/>
-        </w:rPr>
-        <w:t xml:space="preserve">[SCREENSHOT: 3.3-inventory-list.png]</w:t>
-      </w:r>
-    </w:p>
-    <w:p>
-      <w:pPr>
-        <w:spacing w:after="80" w:before="80"/>
-      </w:pPr>
-      <w:r>
-        <w:rPr>
-          <w:rFonts w:ascii="Arial" w:cs="Arial" w:eastAsia="Arial" w:hAnsi="Arial"/>
-          <w:b/>
-          <w:bCs/>
-          <w:i/>
-          <w:iCs/>
-          <w:color w:val="666666"/>
-          <w:sz w:val="20"/>
-          <w:szCs w:val="20"/>
-        </w:rPr>
-        <w:t xml:space="preserve">[SCREENSHOT: 3.3-new-product-form.png]</w:t>
-      </w:r>
-    </w:p>
-    <w:p>
-      <w:pPr>
-        <w:spacing w:after="80" w:before="80"/>
-      </w:pPr>
-      <w:r>
-        <w:rPr>
-          <w:rFonts w:ascii="Arial" w:cs="Arial" w:eastAsia="Arial" w:hAnsi="Arial"/>
-          <w:b/>
-          <w:bCs/>
-          <w:i/>
-          <w:iCs/>
-          <w:color w:val="666666"/>
-          <w:sz w:val="20"/>
-          <w:szCs w:val="20"/>
-        </w:rPr>
-        <w:t xml:space="preserve">[SCREENSHOT: 3.3-stock-adjustment.png]</w:t>
+        <w:jc w:val="center"/>
+        <w:spacing w:after="120" w:before="60"/>
+      </w:pPr>
+      <w:r>
+        <w:drawing>
+          <wp:inline distT="0" distB="0" distL="0" distR="0">
+            <wp:extent cx="5943600" cy="3714750"/>
+            <wp:effectExtent l="0" t="0" r="0" b="0"/>
+            <wp:docPr id="10" name="3_3-inventory-list_png" descr="3.3-inventory-list.png"/>
+            <wp:cNvGraphicFramePr>
+              <a:graphicFrameLocks xmlns:a="http://schemas.openxmlformats.org/drawingml/2006/main" noChangeAspect="1"/>
+            </wp:cNvGraphicFramePr>
+            <a:graphic xmlns:a="http://schemas.openxmlformats.org/drawingml/2006/main">
+              <a:graphicData uri="http://schemas.openxmlformats.org/drawingml/2006/picture">
+                <pic:pic xmlns:pic="http://schemas.openxmlformats.org/drawingml/2006/picture">
+                  <pic:nvPicPr>
+                    <pic:cNvPr id="10" name="3_3-inventory-list_png"/>
+                    <pic:cNvPicPr/>
+                  </pic:nvPicPr>
+                  <pic:blipFill>
+                    <a:blip r:embed="rId19"/>
+                    <a:stretch>
+                      <a:fillRect/>
+                    </a:stretch>
+                  </pic:blipFill>
+                  <pic:spPr>
+                    <a:xfrm>
+                      <a:off x="0" y="0"/>
+                      <a:ext cx="5943600" cy="3714750"/>
+                    </a:xfrm>
+                    <a:prstGeom prst="rect">
+                      <a:avLst/>
+                    </a:prstGeom>
+                  </pic:spPr>
+                </pic:pic>
+              </a:graphicData>
+            </a:graphic>
+          </wp:inline>
+        </w:drawing>
+      </w:r>
+    </w:p>
+    <w:p>
+      <w:pPr>
+        <w:jc w:val="center"/>
+        <w:spacing w:after="120" w:before="60"/>
+      </w:pPr>
+      <w:r>
+        <w:drawing>
+          <wp:inline distT="0" distB="0" distL="0" distR="0">
+            <wp:extent cx="5943600" cy="3714750"/>
+            <wp:effectExtent l="0" t="0" r="0" b="0"/>
+            <wp:docPr id="11" name="3_3-new-product-form_png" descr="3.3-new-product-form.png"/>
+            <wp:cNvGraphicFramePr>
+              <a:graphicFrameLocks xmlns:a="http://schemas.openxmlformats.org/drawingml/2006/main" noChangeAspect="1"/>
+            </wp:cNvGraphicFramePr>
+            <a:graphic xmlns:a="http://schemas.openxmlformats.org/drawingml/2006/main">
+              <a:graphicData uri="http://schemas.openxmlformats.org/drawingml/2006/picture">
+                <pic:pic xmlns:pic="http://schemas.openxmlformats.org/drawingml/2006/picture">
+                  <pic:nvPicPr>
+                    <pic:cNvPr id="11" name="3_3-new-product-form_png"/>
+                    <pic:cNvPicPr/>
+                  </pic:nvPicPr>
+                  <pic:blipFill>
+                    <a:blip r:embed="rId20"/>
+                    <a:stretch>
+                      <a:fillRect/>
+                    </a:stretch>
+                  </pic:blipFill>
+                  <pic:spPr>
+                    <a:xfrm>
+                      <a:off x="0" y="0"/>
+                      <a:ext cx="5943600" cy="3714750"/>
+                    </a:xfrm>
+                    <a:prstGeom prst="rect">
+                      <a:avLst/>
+                    </a:prstGeom>
+                  </pic:spPr>
+                </pic:pic>
+              </a:graphicData>
+            </a:graphic>
+          </wp:inline>
+        </w:drawing>
+      </w:r>
+    </w:p>
+    <w:p>
+      <w:pPr>
+        <w:jc w:val="center"/>
+        <w:spacing w:after="120" w:before="60"/>
+      </w:pPr>
+      <w:r>
+        <w:drawing>
+          <wp:inline distT="0" distB="0" distL="0" distR="0">
+            <wp:extent cx="5943600" cy="3714750"/>
+            <wp:effectExtent l="0" t="0" r="0" b="0"/>
+            <wp:docPr id="12" name="3_3-stock-adjustment_png" descr="3.3-stock-adjustment.png"/>
+            <wp:cNvGraphicFramePr>
+              <a:graphicFrameLocks xmlns:a="http://schemas.openxmlformats.org/drawingml/2006/main" noChangeAspect="1"/>
+            </wp:cNvGraphicFramePr>
+            <a:graphic xmlns:a="http://schemas.openxmlformats.org/drawingml/2006/main">
+              <a:graphicData uri="http://schemas.openxmlformats.org/drawingml/2006/picture">
+                <pic:pic xmlns:pic="http://schemas.openxmlformats.org/drawingml/2006/picture">
+                  <pic:nvPicPr>
+                    <pic:cNvPr id="12" name="3_3-stock-adjustment_png"/>
+                    <pic:cNvPicPr/>
+                  </pic:nvPicPr>
+                  <pic:blipFill>
+                    <a:blip r:embed="rId21"/>
+                    <a:stretch>
+                      <a:fillRect/>
+                    </a:stretch>
+                  </pic:blipFill>
+                  <pic:spPr>
+                    <a:xfrm>
+                      <a:off x="0" y="0"/>
+                      <a:ext cx="5943600" cy="3714750"/>
+                    </a:xfrm>
+                    <a:prstGeom prst="rect">
+                      <a:avLst/>
+                    </a:prstGeom>
+                  </pic:spPr>
+                </pic:pic>
+              </a:graphicData>
+            </a:graphic>
+          </wp:inline>
+        </w:drawing>
       </w:r>
     </w:p>
     <w:p>
@@ -3591,56 +3645,131 @@
     </w:p>
     <w:p>
       <w:pPr>
-        <w:spacing w:after="80" w:before="80"/>
-      </w:pPr>
-      <w:r>
-        <w:rPr>
-          <w:rFonts w:ascii="Arial" w:cs="Arial" w:eastAsia="Arial" w:hAnsi="Arial"/>
-          <w:b/>
-          <w:bCs/>
-          <w:i/>
-          <w:iCs/>
-          <w:color w:val="666666"/>
-          <w:sz w:val="20"/>
-          <w:szCs w:val="20"/>
-        </w:rPr>
-        <w:t xml:space="preserve">[SCREENSHOT: 3.4-order-create.png]</w:t>
-      </w:r>
-    </w:p>
-    <w:p>
-      <w:pPr>
-        <w:spacing w:after="80" w:before="80"/>
-      </w:pPr>
-      <w:r>
-        <w:rPr>
-          <w:rFonts w:ascii="Arial" w:cs="Arial" w:eastAsia="Arial" w:hAnsi="Arial"/>
-          <w:b/>
-          <w:bCs/>
-          <w:i/>
-          <w:iCs/>
-          <w:color w:val="666666"/>
-          <w:sz w:val="20"/>
-          <w:szCs w:val="20"/>
-        </w:rPr>
-        <w:t xml:space="preserve">[SCREENSHOT: 3.4-order-detail.png]</w:t>
-      </w:r>
-    </w:p>
-    <w:p>
-      <w:pPr>
-        <w:spacing w:after="80" w:before="80"/>
-      </w:pPr>
-      <w:r>
-        <w:rPr>
-          <w:rFonts w:ascii="Arial" w:cs="Arial" w:eastAsia="Arial" w:hAnsi="Arial"/>
-          <w:b/>
-          <w:bCs/>
-          <w:i/>
-          <w:iCs/>
-          <w:color w:val="666666"/>
-          <w:sz w:val="20"/>
-          <w:szCs w:val="20"/>
-        </w:rPr>
-        <w:t xml:space="preserve">[SCREENSHOT: 3.4-order-list.png]</w:t>
+        <w:jc w:val="center"/>
+        <w:spacing w:after="120" w:before="60"/>
+      </w:pPr>
+      <w:r>
+        <w:drawing>
+          <wp:inline distT="0" distB="0" distL="0" distR="0">
+            <wp:extent cx="5943600" cy="3714750"/>
+            <wp:effectExtent l="0" t="0" r="0" b="0"/>
+            <wp:docPr id="13" name="3_4-order-create_png" descr="3.4-order-create.png"/>
+            <wp:cNvGraphicFramePr>
+              <a:graphicFrameLocks xmlns:a="http://schemas.openxmlformats.org/drawingml/2006/main" noChangeAspect="1"/>
+            </wp:cNvGraphicFramePr>
+            <a:graphic xmlns:a="http://schemas.openxmlformats.org/drawingml/2006/main">
+              <a:graphicData uri="http://schemas.openxmlformats.org/drawingml/2006/picture">
+                <pic:pic xmlns:pic="http://schemas.openxmlformats.org/drawingml/2006/picture">
+                  <pic:nvPicPr>
+                    <pic:cNvPr id="13" name="3_4-order-create_png"/>
+                    <pic:cNvPicPr/>
+                  </pic:nvPicPr>
+                  <pic:blipFill>
+                    <a:blip r:embed="rId22"/>
+                    <a:stretch>
+                      <a:fillRect/>
+                    </a:stretch>
+                  </pic:blipFill>
+                  <pic:spPr>
+                    <a:xfrm>
+                      <a:off x="0" y="0"/>
+                      <a:ext cx="5943600" cy="3714750"/>
+                    </a:xfrm>
+                    <a:prstGeom prst="rect">
+                      <a:avLst/>
+                    </a:prstGeom>
+                  </pic:spPr>
+                </pic:pic>
+              </a:graphicData>
+            </a:graphic>
+          </wp:inline>
+        </w:drawing>
+      </w:r>
+    </w:p>
+    <w:p>
+      <w:pPr>
+        <w:jc w:val="center"/>
+        <w:spacing w:after="120" w:before="60"/>
+      </w:pPr>
+      <w:r>
+        <w:drawing>
+          <wp:inline distT="0" distB="0" distL="0" distR="0">
+            <wp:extent cx="5943600" cy="3714750"/>
+            <wp:effectExtent l="0" t="0" r="0" b="0"/>
+            <wp:docPr id="14" name="3_4-order-detail_png" descr="3.4-order-detail.png"/>
+            <wp:cNvGraphicFramePr>
+              <a:graphicFrameLocks xmlns:a="http://schemas.openxmlformats.org/drawingml/2006/main" noChangeAspect="1"/>
+            </wp:cNvGraphicFramePr>
+            <a:graphic xmlns:a="http://schemas.openxmlformats.org/drawingml/2006/main">
+              <a:graphicData uri="http://schemas.openxmlformats.org/drawingml/2006/picture">
+                <pic:pic xmlns:pic="http://schemas.openxmlformats.org/drawingml/2006/picture">
+                  <pic:nvPicPr>
+                    <pic:cNvPr id="14" name="3_4-order-detail_png"/>
+                    <pic:cNvPicPr/>
+                  </pic:nvPicPr>
+                  <pic:blipFill>
+                    <a:blip r:embed="rId23"/>
+                    <a:stretch>
+                      <a:fillRect/>
+                    </a:stretch>
+                  </pic:blipFill>
+                  <pic:spPr>
+                    <a:xfrm>
+                      <a:off x="0" y="0"/>
+                      <a:ext cx="5943600" cy="3714750"/>
+                    </a:xfrm>
+                    <a:prstGeom prst="rect">
+                      <a:avLst/>
+                    </a:prstGeom>
+                  </pic:spPr>
+                </pic:pic>
+              </a:graphicData>
+            </a:graphic>
+          </wp:inline>
+        </w:drawing>
+      </w:r>
+    </w:p>
+    <w:p>
+      <w:pPr>
+        <w:jc w:val="center"/>
+        <w:spacing w:after="120" w:before="60"/>
+      </w:pPr>
+      <w:r>
+        <w:drawing>
+          <wp:inline distT="0" distB="0" distL="0" distR="0">
+            <wp:extent cx="5943600" cy="3714750"/>
+            <wp:effectExtent l="0" t="0" r="0" b="0"/>
+            <wp:docPr id="15" name="3_4-order-list_png" descr="3.4-order-list.png"/>
+            <wp:cNvGraphicFramePr>
+              <a:graphicFrameLocks xmlns:a="http://schemas.openxmlformats.org/drawingml/2006/main" noChangeAspect="1"/>
+            </wp:cNvGraphicFramePr>
+            <a:graphic xmlns:a="http://schemas.openxmlformats.org/drawingml/2006/main">
+              <a:graphicData uri="http://schemas.openxmlformats.org/drawingml/2006/picture">
+                <pic:pic xmlns:pic="http://schemas.openxmlformats.org/drawingml/2006/picture">
+                  <pic:nvPicPr>
+                    <pic:cNvPr id="15" name="3_4-order-list_png"/>
+                    <pic:cNvPicPr/>
+                  </pic:nvPicPr>
+                  <pic:blipFill>
+                    <a:blip r:embed="rId24"/>
+                    <a:stretch>
+                      <a:fillRect/>
+                    </a:stretch>
+                  </pic:blipFill>
+                  <pic:spPr>
+                    <a:xfrm>
+                      <a:off x="0" y="0"/>
+                      <a:ext cx="5943600" cy="3714750"/>
+                    </a:xfrm>
+                    <a:prstGeom prst="rect">
+                      <a:avLst/>
+                    </a:prstGeom>
+                  </pic:spPr>
+                </pic:pic>
+              </a:graphicData>
+            </a:graphic>
+          </wp:inline>
+        </w:drawing>
       </w:r>
     </w:p>
     <w:p>
@@ -3873,56 +4002,131 @@
     </w:p>
     <w:p>
       <w:pPr>
-        <w:spacing w:after="80" w:before="80"/>
-      </w:pPr>
-      <w:r>
-        <w:rPr>
-          <w:rFonts w:ascii="Arial" w:cs="Arial" w:eastAsia="Arial" w:hAnsi="Arial"/>
-          <w:b/>
-          <w:bCs/>
-          <w:i/>
-          <w:iCs/>
-          <w:color w:val="666666"/>
-          <w:sz w:val="20"/>
-          <w:szCs w:val="20"/>
-        </w:rPr>
-        <w:t xml:space="preserve">[SCREENSHOT: 3.5-route-builder.png]</w:t>
-      </w:r>
-    </w:p>
-    <w:p>
-      <w:pPr>
-        <w:spacing w:after="80" w:before="80"/>
-      </w:pPr>
-      <w:r>
-        <w:rPr>
-          <w:rFonts w:ascii="Arial" w:cs="Arial" w:eastAsia="Arial" w:hAnsi="Arial"/>
-          <w:b/>
-          <w:bCs/>
-          <w:i/>
-          <w:iCs/>
-          <w:color w:val="666666"/>
-          <w:sz w:val="20"/>
-          <w:szCs w:val="20"/>
-        </w:rPr>
-        <w:t xml:space="preserve">[SCREENSHOT: 3.5-route-map.png]</w:t>
-      </w:r>
-    </w:p>
-    <w:p>
-      <w:pPr>
-        <w:spacing w:after="80" w:before="80"/>
-      </w:pPr>
-      <w:r>
-        <w:rPr>
-          <w:rFonts w:ascii="Arial" w:cs="Arial" w:eastAsia="Arial" w:hAnsi="Arial"/>
-          <w:b/>
-          <w:bCs/>
-          <w:i/>
-          <w:iCs/>
-          <w:color w:val="666666"/>
-          <w:sz w:val="20"/>
-          <w:szCs w:val="20"/>
-        </w:rPr>
-        <w:t xml:space="preserve">[SCREENSHOT: 3.5-driver-assignment.png]</w:t>
+        <w:jc w:val="center"/>
+        <w:spacing w:after="120" w:before="60"/>
+      </w:pPr>
+      <w:r>
+        <w:drawing>
+          <wp:inline distT="0" distB="0" distL="0" distR="0">
+            <wp:extent cx="5943600" cy="3714750"/>
+            <wp:effectExtent l="0" t="0" r="0" b="0"/>
+            <wp:docPr id="16" name="3_5-route-builder_png" descr="3.5-route-builder.png"/>
+            <wp:cNvGraphicFramePr>
+              <a:graphicFrameLocks xmlns:a="http://schemas.openxmlformats.org/drawingml/2006/main" noChangeAspect="1"/>
+            </wp:cNvGraphicFramePr>
+            <a:graphic xmlns:a="http://schemas.openxmlformats.org/drawingml/2006/main">
+              <a:graphicData uri="http://schemas.openxmlformats.org/drawingml/2006/picture">
+                <pic:pic xmlns:pic="http://schemas.openxmlformats.org/drawingml/2006/picture">
+                  <pic:nvPicPr>
+                    <pic:cNvPr id="16" name="3_5-route-builder_png"/>
+                    <pic:cNvPicPr/>
+                  </pic:nvPicPr>
+                  <pic:blipFill>
+                    <a:blip r:embed="rId26"/>
+                    <a:stretch>
+                      <a:fillRect/>
+                    </a:stretch>
+                  </pic:blipFill>
+                  <pic:spPr>
+                    <a:xfrm>
+                      <a:off x="0" y="0"/>
+                      <a:ext cx="5943600" cy="3714750"/>
+                    </a:xfrm>
+                    <a:prstGeom prst="rect">
+                      <a:avLst/>
+                    </a:prstGeom>
+                  </pic:spPr>
+                </pic:pic>
+              </a:graphicData>
+            </a:graphic>
+          </wp:inline>
+        </w:drawing>
+      </w:r>
+    </w:p>
+    <w:p>
+      <w:pPr>
+        <w:jc w:val="center"/>
+        <w:spacing w:after="120" w:before="60"/>
+      </w:pPr>
+      <w:r>
+        <w:drawing>
+          <wp:inline distT="0" distB="0" distL="0" distR="0">
+            <wp:extent cx="5943600" cy="3714750"/>
+            <wp:effectExtent l="0" t="0" r="0" b="0"/>
+            <wp:docPr id="17" name="3_5-route-map_png" descr="3.5-route-map.png"/>
+            <wp:cNvGraphicFramePr>
+              <a:graphicFrameLocks xmlns:a="http://schemas.openxmlformats.org/drawingml/2006/main" noChangeAspect="1"/>
+            </wp:cNvGraphicFramePr>
+            <a:graphic xmlns:a="http://schemas.openxmlformats.org/drawingml/2006/main">
+              <a:graphicData uri="http://schemas.openxmlformats.org/drawingml/2006/picture">
+                <pic:pic xmlns:pic="http://schemas.openxmlformats.org/drawingml/2006/picture">
+                  <pic:nvPicPr>
+                    <pic:cNvPr id="17" name="3_5-route-map_png"/>
+                    <pic:cNvPicPr/>
+                  </pic:nvPicPr>
+                  <pic:blipFill>
+                    <a:blip r:embed="rId27"/>
+                    <a:stretch>
+                      <a:fillRect/>
+                    </a:stretch>
+                  </pic:blipFill>
+                  <pic:spPr>
+                    <a:xfrm>
+                      <a:off x="0" y="0"/>
+                      <a:ext cx="5943600" cy="3714750"/>
+                    </a:xfrm>
+                    <a:prstGeom prst="rect">
+                      <a:avLst/>
+                    </a:prstGeom>
+                  </pic:spPr>
+                </pic:pic>
+              </a:graphicData>
+            </a:graphic>
+          </wp:inline>
+        </w:drawing>
+      </w:r>
+    </w:p>
+    <w:p>
+      <w:pPr>
+        <w:jc w:val="center"/>
+        <w:spacing w:after="120" w:before="60"/>
+      </w:pPr>
+      <w:r>
+        <w:drawing>
+          <wp:inline distT="0" distB="0" distL="0" distR="0">
+            <wp:extent cx="5943600" cy="3714750"/>
+            <wp:effectExtent l="0" t="0" r="0" b="0"/>
+            <wp:docPr id="18" name="3_5-driver-assignment_png" descr="3.5-driver-assignment.png"/>
+            <wp:cNvGraphicFramePr>
+              <a:graphicFrameLocks xmlns:a="http://schemas.openxmlformats.org/drawingml/2006/main" noChangeAspect="1"/>
+            </wp:cNvGraphicFramePr>
+            <a:graphic xmlns:a="http://schemas.openxmlformats.org/drawingml/2006/main">
+              <a:graphicData uri="http://schemas.openxmlformats.org/drawingml/2006/picture">
+                <pic:pic xmlns:pic="http://schemas.openxmlformats.org/drawingml/2006/picture">
+                  <pic:nvPicPr>
+                    <pic:cNvPr id="18" name="3_5-driver-assignment_png"/>
+                    <pic:cNvPicPr/>
+                  </pic:nvPicPr>
+                  <pic:blipFill>
+                    <a:blip r:embed="rId25"/>
+                    <a:stretch>
+                      <a:fillRect/>
+                    </a:stretch>
+                  </pic:blipFill>
+                  <pic:spPr>
+                    <a:xfrm>
+                      <a:off x="0" y="0"/>
+                      <a:ext cx="5943600" cy="3714750"/>
+                    </a:xfrm>
+                    <a:prstGeom prst="rect">
+                      <a:avLst/>
+                    </a:prstGeom>
+                  </pic:spPr>
+                </pic:pic>
+              </a:graphicData>
+            </a:graphic>
+          </wp:inline>
+        </w:drawing>
       </w:r>
     </w:p>
     <w:p>
@@ -4279,56 +4483,131 @@
     </w:p>
     <w:p>
       <w:pPr>
-        <w:spacing w:after="80" w:before="80"/>
-      </w:pPr>
-      <w:r>
-        <w:rPr>
-          <w:rFonts w:ascii="Arial" w:cs="Arial" w:eastAsia="Arial" w:hAnsi="Arial"/>
-          <w:b/>
-          <w:bCs/>
-          <w:i/>
-          <w:iCs/>
-          <w:color w:val="666666"/>
-          <w:sz w:val="20"/>
-          <w:szCs w:val="20"/>
-        </w:rPr>
-        <w:t xml:space="preserve">[SCREENSHOT: 3.6-invoice-generate.png]</w:t>
-      </w:r>
-    </w:p>
-    <w:p>
-      <w:pPr>
-        <w:spacing w:after="80" w:before="80"/>
-      </w:pPr>
-      <w:r>
-        <w:rPr>
-          <w:rFonts w:ascii="Arial" w:cs="Arial" w:eastAsia="Arial" w:hAnsi="Arial"/>
-          <w:b/>
-          <w:bCs/>
-          <w:i/>
-          <w:iCs/>
-          <w:color w:val="666666"/>
-          <w:sz w:val="20"/>
-          <w:szCs w:val="20"/>
-        </w:rPr>
-        <w:t xml:space="preserve">[SCREENSHOT: 3.6-invoice-detail.png]</w:t>
-      </w:r>
-    </w:p>
-    <w:p>
-      <w:pPr>
-        <w:spacing w:after="80" w:before="80"/>
-      </w:pPr>
-      <w:r>
-        <w:rPr>
-          <w:rFonts w:ascii="Arial" w:cs="Arial" w:eastAsia="Arial" w:hAnsi="Arial"/>
-          <w:b/>
-          <w:bCs/>
-          <w:i/>
-          <w:iCs/>
-          <w:color w:val="666666"/>
-          <w:sz w:val="20"/>
-          <w:szCs w:val="20"/>
-        </w:rPr>
-        <w:t xml:space="preserve">[SCREENSHOT: 3.6-finance-dashboard.png]</w:t>
+        <w:jc w:val="center"/>
+        <w:spacing w:after="120" w:before="60"/>
+      </w:pPr>
+      <w:r>
+        <w:drawing>
+          <wp:inline distT="0" distB="0" distL="0" distR="0">
+            <wp:extent cx="5943600" cy="3714750"/>
+            <wp:effectExtent l="0" t="0" r="0" b="0"/>
+            <wp:docPr id="19" name="3_6-invoice-generate_png" descr="3.6-invoice-generate.png"/>
+            <wp:cNvGraphicFramePr>
+              <a:graphicFrameLocks xmlns:a="http://schemas.openxmlformats.org/drawingml/2006/main" noChangeAspect="1"/>
+            </wp:cNvGraphicFramePr>
+            <a:graphic xmlns:a="http://schemas.openxmlformats.org/drawingml/2006/main">
+              <a:graphicData uri="http://schemas.openxmlformats.org/drawingml/2006/picture">
+                <pic:pic xmlns:pic="http://schemas.openxmlformats.org/drawingml/2006/picture">
+                  <pic:nvPicPr>
+                    <pic:cNvPr id="19" name="3_6-invoice-generate_png"/>
+                    <pic:cNvPicPr/>
+                  </pic:nvPicPr>
+                  <pic:blipFill>
+                    <a:blip r:embed="rId30"/>
+                    <a:stretch>
+                      <a:fillRect/>
+                    </a:stretch>
+                  </pic:blipFill>
+                  <pic:spPr>
+                    <a:xfrm>
+                      <a:off x="0" y="0"/>
+                      <a:ext cx="5943600" cy="3714750"/>
+                    </a:xfrm>
+                    <a:prstGeom prst="rect">
+                      <a:avLst/>
+                    </a:prstGeom>
+                  </pic:spPr>
+                </pic:pic>
+              </a:graphicData>
+            </a:graphic>
+          </wp:inline>
+        </w:drawing>
+      </w:r>
+    </w:p>
+    <w:p>
+      <w:pPr>
+        <w:jc w:val="center"/>
+        <w:spacing w:after="120" w:before="60"/>
+      </w:pPr>
+      <w:r>
+        <w:drawing>
+          <wp:inline distT="0" distB="0" distL="0" distR="0">
+            <wp:extent cx="5943600" cy="3714750"/>
+            <wp:effectExtent l="0" t="0" r="0" b="0"/>
+            <wp:docPr id="20" name="3_6-invoice-detail_png" descr="3.6-invoice-detail.png"/>
+            <wp:cNvGraphicFramePr>
+              <a:graphicFrameLocks xmlns:a="http://schemas.openxmlformats.org/drawingml/2006/main" noChangeAspect="1"/>
+            </wp:cNvGraphicFramePr>
+            <a:graphic xmlns:a="http://schemas.openxmlformats.org/drawingml/2006/main">
+              <a:graphicData uri="http://schemas.openxmlformats.org/drawingml/2006/picture">
+                <pic:pic xmlns:pic="http://schemas.openxmlformats.org/drawingml/2006/picture">
+                  <pic:nvPicPr>
+                    <pic:cNvPr id="20" name="3_6-invoice-detail_png"/>
+                    <pic:cNvPicPr/>
+                  </pic:nvPicPr>
+                  <pic:blipFill>
+                    <a:blip r:embed="rId29"/>
+                    <a:stretch>
+                      <a:fillRect/>
+                    </a:stretch>
+                  </pic:blipFill>
+                  <pic:spPr>
+                    <a:xfrm>
+                      <a:off x="0" y="0"/>
+                      <a:ext cx="5943600" cy="3714750"/>
+                    </a:xfrm>
+                    <a:prstGeom prst="rect">
+                      <a:avLst/>
+                    </a:prstGeom>
+                  </pic:spPr>
+                </pic:pic>
+              </a:graphicData>
+            </a:graphic>
+          </wp:inline>
+        </w:drawing>
+      </w:r>
+    </w:p>
+    <w:p>
+      <w:pPr>
+        <w:jc w:val="center"/>
+        <w:spacing w:after="120" w:before="60"/>
+      </w:pPr>
+      <w:r>
+        <w:drawing>
+          <wp:inline distT="0" distB="0" distL="0" distR="0">
+            <wp:extent cx="5943600" cy="3714750"/>
+            <wp:effectExtent l="0" t="0" r="0" b="0"/>
+            <wp:docPr id="21" name="3_6-finance-dashboard_png" descr="3.6-finance-dashboard.png"/>
+            <wp:cNvGraphicFramePr>
+              <a:graphicFrameLocks xmlns:a="http://schemas.openxmlformats.org/drawingml/2006/main" noChangeAspect="1"/>
+            </wp:cNvGraphicFramePr>
+            <a:graphic xmlns:a="http://schemas.openxmlformats.org/drawingml/2006/main">
+              <a:graphicData uri="http://schemas.openxmlformats.org/drawingml/2006/picture">
+                <pic:pic xmlns:pic="http://schemas.openxmlformats.org/drawingml/2006/picture">
+                  <pic:nvPicPr>
+                    <pic:cNvPr id="21" name="3_6-finance-dashboard_png"/>
+                    <pic:cNvPicPr/>
+                  </pic:nvPicPr>
+                  <pic:blipFill>
+                    <a:blip r:embed="rId28"/>
+                    <a:stretch>
+                      <a:fillRect/>
+                    </a:stretch>
+                  </pic:blipFill>
+                  <pic:spPr>
+                    <a:xfrm>
+                      <a:off x="0" y="0"/>
+                      <a:ext cx="5943600" cy="3714750"/>
+                    </a:xfrm>
+                    <a:prstGeom prst="rect">
+                      <a:avLst/>
+                    </a:prstGeom>
+                  </pic:spPr>
+                </pic:pic>
+              </a:graphicData>
+            </a:graphic>
+          </wp:inline>
+        </w:drawing>
       </w:r>
     </w:p>
     <w:p>
@@ -4732,56 +5011,131 @@
     </w:p>
     <w:p>
       <w:pPr>
-        <w:spacing w:after="80" w:before="80"/>
-      </w:pPr>
-      <w:r>
-        <w:rPr>
-          <w:rFonts w:ascii="Arial" w:cs="Arial" w:eastAsia="Arial" w:hAnsi="Arial"/>
-          <w:b/>
-          <w:bCs/>
-          <w:i/>
-          <w:iCs/>
-          <w:color w:val="666666"/>
-          <w:sz w:val="20"/>
-          <w:szCs w:val="20"/>
-        </w:rPr>
-        <w:t xml:space="preserve">[SCREENSHOT: 3.7-credit-balance-panel.png]</w:t>
-      </w:r>
-    </w:p>
-    <w:p>
-      <w:pPr>
-        <w:spacing w:after="80" w:before="80"/>
-      </w:pPr>
-      <w:r>
-        <w:rPr>
-          <w:rFonts w:ascii="Arial" w:cs="Arial" w:eastAsia="Arial" w:hAnsi="Arial"/>
-          <w:b/>
-          <w:bCs/>
-          <w:i/>
-          <w:iCs/>
-          <w:color w:val="666666"/>
-          <w:sz w:val="20"/>
-          <w:szCs w:val="20"/>
-        </w:rPr>
-        <w:t xml:space="preserve">[SCREENSHOT: 3.7-customer-ledger.png]</w:t>
-      </w:r>
-    </w:p>
-    <w:p>
-      <w:pPr>
-        <w:spacing w:after="80" w:before="80"/>
-      </w:pPr>
-      <w:r>
-        <w:rPr>
-          <w:rFonts w:ascii="Arial" w:cs="Arial" w:eastAsia="Arial" w:hAnsi="Arial"/>
-          <w:b/>
-          <w:bCs/>
-          <w:i/>
-          <w:iCs/>
-          <w:color w:val="666666"/>
-          <w:sz w:val="20"/>
-          <w:szCs w:val="20"/>
-        </w:rPr>
-        <w:t xml:space="preserve">[SCREENSHOT: 3.7-advance-payment-form.png]</w:t>
+        <w:jc w:val="center"/>
+        <w:spacing w:after="120" w:before="60"/>
+      </w:pPr>
+      <w:r>
+        <w:drawing>
+          <wp:inline distT="0" distB="0" distL="0" distR="0">
+            <wp:extent cx="5943600" cy="3714750"/>
+            <wp:effectExtent l="0" t="0" r="0" b="0"/>
+            <wp:docPr id="22" name="3_7-credit-balance-panel_png" descr="3.7-credit-balance-panel.png"/>
+            <wp:cNvGraphicFramePr>
+              <a:graphicFrameLocks xmlns:a="http://schemas.openxmlformats.org/drawingml/2006/main" noChangeAspect="1"/>
+            </wp:cNvGraphicFramePr>
+            <a:graphic xmlns:a="http://schemas.openxmlformats.org/drawingml/2006/main">
+              <a:graphicData uri="http://schemas.openxmlformats.org/drawingml/2006/picture">
+                <pic:pic xmlns:pic="http://schemas.openxmlformats.org/drawingml/2006/picture">
+                  <pic:nvPicPr>
+                    <pic:cNvPr id="22" name="3_7-credit-balance-panel_png"/>
+                    <pic:cNvPicPr/>
+                  </pic:nvPicPr>
+                  <pic:blipFill>
+                    <a:blip r:embed="rId32"/>
+                    <a:stretch>
+                      <a:fillRect/>
+                    </a:stretch>
+                  </pic:blipFill>
+                  <pic:spPr>
+                    <a:xfrm>
+                      <a:off x="0" y="0"/>
+                      <a:ext cx="5943600" cy="3714750"/>
+                    </a:xfrm>
+                    <a:prstGeom prst="rect">
+                      <a:avLst/>
+                    </a:prstGeom>
+                  </pic:spPr>
+                </pic:pic>
+              </a:graphicData>
+            </a:graphic>
+          </wp:inline>
+        </w:drawing>
+      </w:r>
+    </w:p>
+    <w:p>
+      <w:pPr>
+        <w:jc w:val="center"/>
+        <w:spacing w:after="120" w:before="60"/>
+      </w:pPr>
+      <w:r>
+        <w:drawing>
+          <wp:inline distT="0" distB="0" distL="0" distR="0">
+            <wp:extent cx="5943600" cy="3714750"/>
+            <wp:effectExtent l="0" t="0" r="0" b="0"/>
+            <wp:docPr id="23" name="3_7-customer-ledger_png" descr="3.7-customer-ledger.png"/>
+            <wp:cNvGraphicFramePr>
+              <a:graphicFrameLocks xmlns:a="http://schemas.openxmlformats.org/drawingml/2006/main" noChangeAspect="1"/>
+            </wp:cNvGraphicFramePr>
+            <a:graphic xmlns:a="http://schemas.openxmlformats.org/drawingml/2006/main">
+              <a:graphicData uri="http://schemas.openxmlformats.org/drawingml/2006/picture">
+                <pic:pic xmlns:pic="http://schemas.openxmlformats.org/drawingml/2006/picture">
+                  <pic:nvPicPr>
+                    <pic:cNvPr id="23" name="3_7-customer-ledger_png"/>
+                    <pic:cNvPicPr/>
+                  </pic:nvPicPr>
+                  <pic:blipFill>
+                    <a:blip r:embed="rId33"/>
+                    <a:stretch>
+                      <a:fillRect/>
+                    </a:stretch>
+                  </pic:blipFill>
+                  <pic:spPr>
+                    <a:xfrm>
+                      <a:off x="0" y="0"/>
+                      <a:ext cx="5943600" cy="3714750"/>
+                    </a:xfrm>
+                    <a:prstGeom prst="rect">
+                      <a:avLst/>
+                    </a:prstGeom>
+                  </pic:spPr>
+                </pic:pic>
+              </a:graphicData>
+            </a:graphic>
+          </wp:inline>
+        </w:drawing>
+      </w:r>
+    </w:p>
+    <w:p>
+      <w:pPr>
+        <w:jc w:val="center"/>
+        <w:spacing w:after="120" w:before="60"/>
+      </w:pPr>
+      <w:r>
+        <w:drawing>
+          <wp:inline distT="0" distB="0" distL="0" distR="0">
+            <wp:extent cx="5943600" cy="3714750"/>
+            <wp:effectExtent l="0" t="0" r="0" b="0"/>
+            <wp:docPr id="24" name="3_7-advance-payment-form_png" descr="3.7-advance-payment-form.png"/>
+            <wp:cNvGraphicFramePr>
+              <a:graphicFrameLocks xmlns:a="http://schemas.openxmlformats.org/drawingml/2006/main" noChangeAspect="1"/>
+            </wp:cNvGraphicFramePr>
+            <a:graphic xmlns:a="http://schemas.openxmlformats.org/drawingml/2006/main">
+              <a:graphicData uri="http://schemas.openxmlformats.org/drawingml/2006/picture">
+                <pic:pic xmlns:pic="http://schemas.openxmlformats.org/drawingml/2006/picture">
+                  <pic:nvPicPr>
+                    <pic:cNvPr id="24" name="3_7-advance-payment-form_png"/>
+                    <pic:cNvPicPr/>
+                  </pic:nvPicPr>
+                  <pic:blipFill>
+                    <a:blip r:embed="rId31"/>
+                    <a:stretch>
+                      <a:fillRect/>
+                    </a:stretch>
+                  </pic:blipFill>
+                  <pic:spPr>
+                    <a:xfrm>
+                      <a:off x="0" y="0"/>
+                      <a:ext cx="5943600" cy="3714750"/>
+                    </a:xfrm>
+                    <a:prstGeom prst="rect">
+                      <a:avLst/>
+                    </a:prstGeom>
+                  </pic:spPr>
+                </pic:pic>
+              </a:graphicData>
+            </a:graphic>
+          </wp:inline>
+        </w:drawing>
       </w:r>
     </w:p>
     <w:p>
@@ -4927,38 +5281,88 @@
     </w:p>
     <w:p>
       <w:pPr>
-        <w:spacing w:after="80" w:before="80"/>
-      </w:pPr>
-      <w:r>
-        <w:rPr>
-          <w:rFonts w:ascii="Arial" w:cs="Arial" w:eastAsia="Arial" w:hAnsi="Arial"/>
-          <w:b/>
-          <w:bCs/>
-          <w:i/>
-          <w:iCs/>
-          <w:color w:val="666666"/>
-          <w:sz w:val="20"/>
-          <w:szCs w:val="20"/>
-        </w:rPr>
-        <w:t xml:space="preserve">[SCREENSHOT: 3.8-expense-list.png]</w:t>
-      </w:r>
-    </w:p>
-    <w:p>
-      <w:pPr>
-        <w:spacing w:after="80" w:before="80"/>
-      </w:pPr>
-      <w:r>
-        <w:rPr>
-          <w:rFonts w:ascii="Arial" w:cs="Arial" w:eastAsia="Arial" w:hAnsi="Arial"/>
-          <w:b/>
-          <w:bCs/>
-          <w:i/>
-          <w:iCs/>
-          <w:color w:val="666666"/>
-          <w:sz w:val="20"/>
-          <w:szCs w:val="20"/>
-        </w:rPr>
-        <w:t xml:space="preserve">[SCREENSHOT: 3.8-expense-detail.png]</w:t>
+        <w:jc w:val="center"/>
+        <w:spacing w:after="120" w:before="60"/>
+      </w:pPr>
+      <w:r>
+        <w:drawing>
+          <wp:inline distT="0" distB="0" distL="0" distR="0">
+            <wp:extent cx="5943600" cy="3714750"/>
+            <wp:effectExtent l="0" t="0" r="0" b="0"/>
+            <wp:docPr id="25" name="3_8-expense-list_png" descr="3.8-expense-list.png"/>
+            <wp:cNvGraphicFramePr>
+              <a:graphicFrameLocks xmlns:a="http://schemas.openxmlformats.org/drawingml/2006/main" noChangeAspect="1"/>
+            </wp:cNvGraphicFramePr>
+            <a:graphic xmlns:a="http://schemas.openxmlformats.org/drawingml/2006/main">
+              <a:graphicData uri="http://schemas.openxmlformats.org/drawingml/2006/picture">
+                <pic:pic xmlns:pic="http://schemas.openxmlformats.org/drawingml/2006/picture">
+                  <pic:nvPicPr>
+                    <pic:cNvPr id="25" name="3_8-expense-list_png"/>
+                    <pic:cNvPicPr/>
+                  </pic:nvPicPr>
+                  <pic:blipFill>
+                    <a:blip r:embed="rId35"/>
+                    <a:stretch>
+                      <a:fillRect/>
+                    </a:stretch>
+                  </pic:blipFill>
+                  <pic:spPr>
+                    <a:xfrm>
+                      <a:off x="0" y="0"/>
+                      <a:ext cx="5943600" cy="3714750"/>
+                    </a:xfrm>
+                    <a:prstGeom prst="rect">
+                      <a:avLst/>
+                    </a:prstGeom>
+                  </pic:spPr>
+                </pic:pic>
+              </a:graphicData>
+            </a:graphic>
+          </wp:inline>
+        </w:drawing>
+      </w:r>
+    </w:p>
+    <w:p>
+      <w:pPr>
+        <w:jc w:val="center"/>
+        <w:spacing w:after="120" w:before="60"/>
+      </w:pPr>
+      <w:r>
+        <w:drawing>
+          <wp:inline distT="0" distB="0" distL="0" distR="0">
+            <wp:extent cx="5943600" cy="3714750"/>
+            <wp:effectExtent l="0" t="0" r="0" b="0"/>
+            <wp:docPr id="26" name="3_8-expense-detail_png" descr="3.8-expense-detail.png"/>
+            <wp:cNvGraphicFramePr>
+              <a:graphicFrameLocks xmlns:a="http://schemas.openxmlformats.org/drawingml/2006/main" noChangeAspect="1"/>
+            </wp:cNvGraphicFramePr>
+            <a:graphic xmlns:a="http://schemas.openxmlformats.org/drawingml/2006/main">
+              <a:graphicData uri="http://schemas.openxmlformats.org/drawingml/2006/picture">
+                <pic:pic xmlns:pic="http://schemas.openxmlformats.org/drawingml/2006/picture">
+                  <pic:nvPicPr>
+                    <pic:cNvPr id="26" name="3_8-expense-detail_png"/>
+                    <pic:cNvPicPr/>
+                  </pic:nvPicPr>
+                  <pic:blipFill>
+                    <a:blip r:embed="rId34"/>
+                    <a:stretch>
+                      <a:fillRect/>
+                    </a:stretch>
+                  </pic:blipFill>
+                  <pic:spPr>
+                    <a:xfrm>
+                      <a:off x="0" y="0"/>
+                      <a:ext cx="5943600" cy="3714750"/>
+                    </a:xfrm>
+                    <a:prstGeom prst="rect">
+                      <a:avLst/>
+                    </a:prstGeom>
+                  </pic:spPr>
+                </pic:pic>
+              </a:graphicData>
+            </a:graphic>
+          </wp:inline>
+        </w:drawing>
       </w:r>
     </w:p>
     <w:p>
@@ -5133,20 +5537,45 @@
     </w:p>
     <w:p>
       <w:pPr>
-        <w:spacing w:after="80" w:before="80"/>
-      </w:pPr>
-      <w:r>
-        <w:rPr>
-          <w:rFonts w:ascii="Arial" w:cs="Arial" w:eastAsia="Arial" w:hAnsi="Arial"/>
-          <w:b/>
-          <w:bCs/>
-          <w:i/>
-          <w:iCs/>
-          <w:color w:val="666666"/>
-          <w:sz w:val="20"/>
-          <w:szCs w:val="20"/>
-        </w:rPr>
-        <w:t xml:space="preserve">[SCREENSHOT: 3.9-user-management.png]</w:t>
+        <w:jc w:val="center"/>
+        <w:spacing w:after="120" w:before="60"/>
+      </w:pPr>
+      <w:r>
+        <w:drawing>
+          <wp:inline distT="0" distB="0" distL="0" distR="0">
+            <wp:extent cx="5943600" cy="3714750"/>
+            <wp:effectExtent l="0" t="0" r="0" b="0"/>
+            <wp:docPr id="27" name="3_9-user-management_png" descr="3.9-user-management.png"/>
+            <wp:cNvGraphicFramePr>
+              <a:graphicFrameLocks xmlns:a="http://schemas.openxmlformats.org/drawingml/2006/main" noChangeAspect="1"/>
+            </wp:cNvGraphicFramePr>
+            <a:graphic xmlns:a="http://schemas.openxmlformats.org/drawingml/2006/main">
+              <a:graphicData uri="http://schemas.openxmlformats.org/drawingml/2006/picture">
+                <pic:pic xmlns:pic="http://schemas.openxmlformats.org/drawingml/2006/picture">
+                  <pic:nvPicPr>
+                    <pic:cNvPr id="27" name="3_9-user-management_png"/>
+                    <pic:cNvPicPr/>
+                  </pic:nvPicPr>
+                  <pic:blipFill>
+                    <a:blip r:embed="rId36"/>
+                    <a:stretch>
+                      <a:fillRect/>
+                    </a:stretch>
+                  </pic:blipFill>
+                  <pic:spPr>
+                    <a:xfrm>
+                      <a:off x="0" y="0"/>
+                      <a:ext cx="5943600" cy="3714750"/>
+                    </a:xfrm>
+                    <a:prstGeom prst="rect">
+                      <a:avLst/>
+                    </a:prstGeom>
+                  </pic:spPr>
+                </pic:pic>
+              </a:graphicData>
+            </a:graphic>
+          </wp:inline>
+        </w:drawing>
       </w:r>
     </w:p>
     <w:p>
@@ -5395,15 +5824,13 @@
       <w:r>
         <w:rPr>
           <w:rFonts w:ascii="Arial" w:cs="Arial" w:eastAsia="Arial" w:hAnsi="Arial"/>
-          <w:b/>
-          <w:bCs/>
           <w:i/>
           <w:iCs/>
-          <w:color w:val="666666"/>
-          <w:sz w:val="20"/>
-          <w:szCs w:val="20"/>
-        </w:rPr>
-        <w:t xml:space="preserve">[SCREENSHOT: 4.1-driver-route-list-mobile.png]</w:t>
+          <w:color w:val="999999"/>
+          <w:sz w:val="18"/>
+          <w:szCs w:val="18"/>
+        </w:rPr>
+        <w:t xml:space="preserve">[Screenshot not available: 4.1-driver-route-list-mobile.png]</w:t>
       </w:r>
     </w:p>
     <w:p>
@@ -5413,15 +5840,13 @@
       <w:r>
         <w:rPr>
           <w:rFonts w:ascii="Arial" w:cs="Arial" w:eastAsia="Arial" w:hAnsi="Arial"/>
-          <w:b/>
-          <w:bCs/>
           <w:i/>
           <w:iCs/>
-          <w:color w:val="666666"/>
-          <w:sz w:val="20"/>
-          <w:szCs w:val="20"/>
-        </w:rPr>
-        <w:t xml:space="preserve">[SCREENSHOT: 4.1-driver-stop-detail-mobile.png]</w:t>
+          <w:color w:val="999999"/>
+          <w:sz w:val="18"/>
+          <w:szCs w:val="18"/>
+        </w:rPr>
+        <w:t xml:space="preserve">[Screenshot not available: 4.1-driver-stop-detail-mobile.png]</w:t>
       </w:r>
     </w:p>
     <w:p>
@@ -5485,15 +5910,13 @@
       <w:r>
         <w:rPr>
           <w:rFonts w:ascii="Arial" w:cs="Arial" w:eastAsia="Arial" w:hAnsi="Arial"/>
-          <w:b/>
-          <w:bCs/>
           <w:i/>
           <w:iCs/>
-          <w:color w:val="666666"/>
-          <w:sz w:val="20"/>
-          <w:szCs w:val="20"/>
-        </w:rPr>
-        <w:t xml:space="preserve">[SCREENSHOT: 4.2-delivery-confirmation-mobile.png]</w:t>
+          <w:color w:val="999999"/>
+          <w:sz w:val="18"/>
+          <w:szCs w:val="18"/>
+        </w:rPr>
+        <w:t xml:space="preserve">[Screenshot not available: 4.2-delivery-confirmation-mobile.png]</w:t>
       </w:r>
     </w:p>
     <w:p>
@@ -5557,15 +5980,13 @@
       <w:r>
         <w:rPr>
           <w:rFonts w:ascii="Arial" w:cs="Arial" w:eastAsia="Arial" w:hAnsi="Arial"/>
-          <w:b/>
-          <w:bCs/>
           <w:i/>
           <w:iCs/>
-          <w:color w:val="666666"/>
-          <w:sz w:val="20"/>
-          <w:szCs w:val="20"/>
-        </w:rPr>
-        <w:t xml:space="preserve">[SCREENSHOT: 4.3-failed-delivery-mobile.png]</w:t>
+          <w:color w:val="999999"/>
+          <w:sz w:val="18"/>
+          <w:szCs w:val="18"/>
+        </w:rPr>
+        <w:t xml:space="preserve">[Screenshot not available: 4.3-failed-delivery-mobile.png]</w:t>
       </w:r>
     </w:p>
     <w:p>
@@ -5673,15 +6094,13 @@
       <w:r>
         <w:rPr>
           <w:rFonts w:ascii="Arial" w:cs="Arial" w:eastAsia="Arial" w:hAnsi="Arial"/>
-          <w:b/>
-          <w:bCs/>
           <w:i/>
           <w:iCs/>
-          <w:color w:val="666666"/>
-          <w:sz w:val="20"/>
-          <w:szCs w:val="20"/>
-        </w:rPr>
-        <w:t xml:space="preserve">[SCREENSHOT: 4.5-expense-form-mobile.png]</w:t>
+          <w:color w:val="999999"/>
+          <w:sz w:val="18"/>
+          <w:szCs w:val="18"/>
+        </w:rPr>
+        <w:t xml:space="preserve">[Screenshot not available: 4.5-expense-form-mobile.png]</w:t>
       </w:r>
     </w:p>
     <w:p>
@@ -5765,20 +6184,45 @@
     </w:p>
     <w:p>
       <w:pPr>
-        <w:spacing w:after="80" w:before="80"/>
-      </w:pPr>
-      <w:r>
-        <w:rPr>
-          <w:rFonts w:ascii="Arial" w:cs="Arial" w:eastAsia="Arial" w:hAnsi="Arial"/>
-          <w:b/>
-          <w:bCs/>
-          <w:i/>
-          <w:iCs/>
-          <w:color w:val="666666"/>
-          <w:sz w:val="20"/>
-          <w:szCs w:val="20"/>
-        </w:rPr>
-        <w:t xml:space="preserve">[SCREENSHOT: 5.1-customer-login.png]</w:t>
+        <w:jc w:val="center"/>
+        <w:spacing w:after="120" w:before="60"/>
+      </w:pPr>
+      <w:r>
+        <w:drawing>
+          <wp:inline distT="0" distB="0" distL="0" distR="0">
+            <wp:extent cx="5943600" cy="3714750"/>
+            <wp:effectExtent l="0" t="0" r="0" b="0"/>
+            <wp:docPr id="28" name="5_1-customer-login_png" descr="5.1-customer-login.png"/>
+            <wp:cNvGraphicFramePr>
+              <a:graphicFrameLocks xmlns:a="http://schemas.openxmlformats.org/drawingml/2006/main" noChangeAspect="1"/>
+            </wp:cNvGraphicFramePr>
+            <a:graphic xmlns:a="http://schemas.openxmlformats.org/drawingml/2006/main">
+              <a:graphicData uri="http://schemas.openxmlformats.org/drawingml/2006/picture">
+                <pic:pic xmlns:pic="http://schemas.openxmlformats.org/drawingml/2006/picture">
+                  <pic:nvPicPr>
+                    <pic:cNvPr id="28" name="5_1-customer-login_png"/>
+                    <pic:cNvPicPr/>
+                  </pic:nvPicPr>
+                  <pic:blipFill>
+                    <a:blip r:embed="rId37"/>
+                    <a:stretch>
+                      <a:fillRect/>
+                    </a:stretch>
+                  </pic:blipFill>
+                  <pic:spPr>
+                    <a:xfrm>
+                      <a:off x="0" y="0"/>
+                      <a:ext cx="5943600" cy="3714750"/>
+                    </a:xfrm>
+                    <a:prstGeom prst="rect">
+                      <a:avLst/>
+                    </a:prstGeom>
+                  </pic:spPr>
+                </pic:pic>
+              </a:graphicData>
+            </a:graphic>
+          </wp:inline>
+        </w:drawing>
       </w:r>
     </w:p>
     <w:p>
@@ -5837,20 +6281,45 @@
     </w:p>
     <w:p>
       <w:pPr>
-        <w:spacing w:after="80" w:before="80"/>
-      </w:pPr>
-      <w:r>
-        <w:rPr>
-          <w:rFonts w:ascii="Arial" w:cs="Arial" w:eastAsia="Arial" w:hAnsi="Arial"/>
-          <w:b/>
-          <w:bCs/>
-          <w:i/>
-          <w:iCs/>
-          <w:color w:val="666666"/>
-          <w:sz w:val="20"/>
-          <w:szCs w:val="20"/>
-        </w:rPr>
-        <w:t xml:space="preserve">[SCREENSHOT: 5.2-customer-order-list.png]</w:t>
+        <w:jc w:val="center"/>
+        <w:spacing w:after="120" w:before="60"/>
+      </w:pPr>
+      <w:r>
+        <w:drawing>
+          <wp:inline distT="0" distB="0" distL="0" distR="0">
+            <wp:extent cx="5943600" cy="3714750"/>
+            <wp:effectExtent l="0" t="0" r="0" b="0"/>
+            <wp:docPr id="29" name="5_2-customer-order-list_png" descr="5.2-customer-order-list.png"/>
+            <wp:cNvGraphicFramePr>
+              <a:graphicFrameLocks xmlns:a="http://schemas.openxmlformats.org/drawingml/2006/main" noChangeAspect="1"/>
+            </wp:cNvGraphicFramePr>
+            <a:graphic xmlns:a="http://schemas.openxmlformats.org/drawingml/2006/main">
+              <a:graphicData uri="http://schemas.openxmlformats.org/drawingml/2006/picture">
+                <pic:pic xmlns:pic="http://schemas.openxmlformats.org/drawingml/2006/picture">
+                  <pic:nvPicPr>
+                    <pic:cNvPr id="29" name="5_2-customer-order-list_png"/>
+                    <pic:cNvPicPr/>
+                  </pic:nvPicPr>
+                  <pic:blipFill>
+                    <a:blip r:embed="rId38"/>
+                    <a:stretch>
+                      <a:fillRect/>
+                    </a:stretch>
+                  </pic:blipFill>
+                  <pic:spPr>
+                    <a:xfrm>
+                      <a:off x="0" y="0"/>
+                      <a:ext cx="5943600" cy="3714750"/>
+                    </a:xfrm>
+                    <a:prstGeom prst="rect">
+                      <a:avLst/>
+                    </a:prstGeom>
+                  </pic:spPr>
+                </pic:pic>
+              </a:graphicData>
+            </a:graphic>
+          </wp:inline>
+        </w:drawing>
       </w:r>
     </w:p>
     <w:p>
@@ -5909,20 +6378,45 @@
     </w:p>
     <w:p>
       <w:pPr>
-        <w:spacing w:after="80" w:before="80"/>
-      </w:pPr>
-      <w:r>
-        <w:rPr>
-          <w:rFonts w:ascii="Arial" w:cs="Arial" w:eastAsia="Arial" w:hAnsi="Arial"/>
-          <w:b/>
-          <w:bCs/>
-          <w:i/>
-          <w:iCs/>
-          <w:color w:val="666666"/>
-          <w:sz w:val="20"/>
-          <w:szCs w:val="20"/>
-        </w:rPr>
-        <w:t xml:space="preserve">[SCREENSHOT: 5.3-customer-statement.png]</w:t>
+        <w:jc w:val="center"/>
+        <w:spacing w:after="120" w:before="60"/>
+      </w:pPr>
+      <w:r>
+        <w:drawing>
+          <wp:inline distT="0" distB="0" distL="0" distR="0">
+            <wp:extent cx="5943600" cy="3714750"/>
+            <wp:effectExtent l="0" t="0" r="0" b="0"/>
+            <wp:docPr id="30" name="5_3-customer-statement_png" descr="5.3-customer-statement.png"/>
+            <wp:cNvGraphicFramePr>
+              <a:graphicFrameLocks xmlns:a="http://schemas.openxmlformats.org/drawingml/2006/main" noChangeAspect="1"/>
+            </wp:cNvGraphicFramePr>
+            <a:graphic xmlns:a="http://schemas.openxmlformats.org/drawingml/2006/main">
+              <a:graphicData uri="http://schemas.openxmlformats.org/drawingml/2006/picture">
+                <pic:pic xmlns:pic="http://schemas.openxmlformats.org/drawingml/2006/picture">
+                  <pic:nvPicPr>
+                    <pic:cNvPr id="30" name="5_3-customer-statement_png"/>
+                    <pic:cNvPicPr/>
+                  </pic:nvPicPr>
+                  <pic:blipFill>
+                    <a:blip r:embed="rId39"/>
+                    <a:stretch>
+                      <a:fillRect/>
+                    </a:stretch>
+                  </pic:blipFill>
+                  <pic:spPr>
+                    <a:xfrm>
+                      <a:off x="0" y="0"/>
+                      <a:ext cx="5943600" cy="3714750"/>
+                    </a:xfrm>
+                    <a:prstGeom prst="rect">
+                      <a:avLst/>
+                    </a:prstGeom>
+                  </pic:spPr>
+                </pic:pic>
+              </a:graphicData>
+            </a:graphic>
+          </wp:inline>
+        </w:drawing>
       </w:r>
     </w:p>
     <w:p>
@@ -5981,20 +6475,45 @@
     </w:p>
     <w:p>
       <w:pPr>
-        <w:spacing w:after="80" w:before="80"/>
-      </w:pPr>
-      <w:r>
-        <w:rPr>
-          <w:rFonts w:ascii="Arial" w:cs="Arial" w:eastAsia="Arial" w:hAnsi="Arial"/>
-          <w:b/>
-          <w:bCs/>
-          <w:i/>
-          <w:iCs/>
-          <w:color w:val="666666"/>
-          <w:sz w:val="20"/>
-          <w:szCs w:val="20"/>
-        </w:rPr>
-        <w:t xml:space="preserve">[SCREENSHOT: 5.4-customer-invoice.png]</w:t>
+        <w:jc w:val="center"/>
+        <w:spacing w:after="120" w:before="60"/>
+      </w:pPr>
+      <w:r>
+        <w:drawing>
+          <wp:inline distT="0" distB="0" distL="0" distR="0">
+            <wp:extent cx="5943600" cy="3714750"/>
+            <wp:effectExtent l="0" t="0" r="0" b="0"/>
+            <wp:docPr id="31" name="5_4-customer-invoice_png" descr="5.4-customer-invoice.png"/>
+            <wp:cNvGraphicFramePr>
+              <a:graphicFrameLocks xmlns:a="http://schemas.openxmlformats.org/drawingml/2006/main" noChangeAspect="1"/>
+            </wp:cNvGraphicFramePr>
+            <a:graphic xmlns:a="http://schemas.openxmlformats.org/drawingml/2006/main">
+              <a:graphicData uri="http://schemas.openxmlformats.org/drawingml/2006/picture">
+                <pic:pic xmlns:pic="http://schemas.openxmlformats.org/drawingml/2006/picture">
+                  <pic:nvPicPr>
+                    <pic:cNvPr id="31" name="5_4-customer-invoice_png"/>
+                    <pic:cNvPicPr/>
+                  </pic:nvPicPr>
+                  <pic:blipFill>
+                    <a:blip r:embed="rId40"/>
+                    <a:stretch>
+                      <a:fillRect/>
+                    </a:stretch>
+                  </pic:blipFill>
+                  <pic:spPr>
+                    <a:xfrm>
+                      <a:off x="0" y="0"/>
+                      <a:ext cx="5943600" cy="3714750"/>
+                    </a:xfrm>
+                    <a:prstGeom prst="rect">
+                      <a:avLst/>
+                    </a:prstGeom>
+                  </pic:spPr>
+                </pic:pic>
+              </a:graphicData>
+            </a:graphic>
+          </wp:inline>
+        </w:drawing>
       </w:r>
     </w:p>
     <w:p>
@@ -6053,20 +6572,45 @@
     </w:p>
     <w:p>
       <w:pPr>
-        <w:spacing w:after="80" w:before="80"/>
-      </w:pPr>
-      <w:r>
-        <w:rPr>
-          <w:rFonts w:ascii="Arial" w:cs="Arial" w:eastAsia="Arial" w:hAnsi="Arial"/>
-          <w:b/>
-          <w:bCs/>
-          <w:i/>
-          <w:iCs/>
-          <w:color w:val="666666"/>
-          <w:sz w:val="20"/>
-          <w:szCs w:val="20"/>
-        </w:rPr>
-        <w:t xml:space="preserve">[SCREENSHOT: 5.5-customer-profile.png]</w:t>
+        <w:jc w:val="center"/>
+        <w:spacing w:after="120" w:before="60"/>
+      </w:pPr>
+      <w:r>
+        <w:drawing>
+          <wp:inline distT="0" distB="0" distL="0" distR="0">
+            <wp:extent cx="5943600" cy="3714750"/>
+            <wp:effectExtent l="0" t="0" r="0" b="0"/>
+            <wp:docPr id="32" name="5_5-customer-profile_png" descr="5.5-customer-profile.png"/>
+            <wp:cNvGraphicFramePr>
+              <a:graphicFrameLocks xmlns:a="http://schemas.openxmlformats.org/drawingml/2006/main" noChangeAspect="1"/>
+            </wp:cNvGraphicFramePr>
+            <a:graphic xmlns:a="http://schemas.openxmlformats.org/drawingml/2006/main">
+              <a:graphicData uri="http://schemas.openxmlformats.org/drawingml/2006/picture">
+                <pic:pic xmlns:pic="http://schemas.openxmlformats.org/drawingml/2006/picture">
+                  <pic:nvPicPr>
+                    <pic:cNvPr id="32" name="5_5-customer-profile_png"/>
+                    <pic:cNvPicPr/>
+                  </pic:nvPicPr>
+                  <pic:blipFill>
+                    <a:blip r:embed="rId41"/>
+                    <a:stretch>
+                      <a:fillRect/>
+                    </a:stretch>
+                  </pic:blipFill>
+                  <pic:spPr>
+                    <a:xfrm>
+                      <a:off x="0" y="0"/>
+                      <a:ext cx="5943600" cy="3714750"/>
+                    </a:xfrm>
+                    <a:prstGeom prst="rect">
+                      <a:avLst/>
+                    </a:prstGeom>
+                  </pic:spPr>
+                </pic:pic>
+              </a:graphicData>
+            </a:graphic>
+          </wp:inline>
+        </w:drawing>
       </w:r>
     </w:p>
     <w:p>
@@ -21092,20 +21636,45 @@
     </w:p>
     <w:p>
       <w:pPr>
-        <w:spacing w:after="80" w:before="80"/>
-      </w:pPr>
-      <w:r>
-        <w:rPr>
-          <w:rFonts w:ascii="Arial" w:cs="Arial" w:eastAsia="Arial" w:hAnsi="Arial"/>
-          <w:b/>
-          <w:bCs/>
-          <w:i/>
-          <w:iCs/>
-          <w:color w:val="666666"/>
-          <w:sz w:val="20"/>
-          <w:szCs w:val="20"/>
-        </w:rPr>
-        <w:t xml:space="preserve">[SCREENSHOT: 9.5-create-tenant-form.png]</w:t>
+        <w:jc w:val="center"/>
+        <w:spacing w:after="120" w:before="60"/>
+      </w:pPr>
+      <w:r>
+        <w:drawing>
+          <wp:inline distT="0" distB="0" distL="0" distR="0">
+            <wp:extent cx="5943600" cy="3714750"/>
+            <wp:effectExtent l="0" t="0" r="0" b="0"/>
+            <wp:docPr id="33" name="9_5-create-tenant-form_png" descr="9.5-create-tenant-form.png"/>
+            <wp:cNvGraphicFramePr>
+              <a:graphicFrameLocks xmlns:a="http://schemas.openxmlformats.org/drawingml/2006/main" noChangeAspect="1"/>
+            </wp:cNvGraphicFramePr>
+            <a:graphic xmlns:a="http://schemas.openxmlformats.org/drawingml/2006/main">
+              <a:graphicData uri="http://schemas.openxmlformats.org/drawingml/2006/picture">
+                <pic:pic xmlns:pic="http://schemas.openxmlformats.org/drawingml/2006/picture">
+                  <pic:nvPicPr>
+                    <pic:cNvPr id="33" name="9_5-create-tenant-form_png"/>
+                    <pic:cNvPicPr/>
+                  </pic:nvPicPr>
+                  <pic:blipFill>
+                    <a:blip r:embed="rId42"/>
+                    <a:stretch>
+                      <a:fillRect/>
+                    </a:stretch>
+                  </pic:blipFill>
+                  <pic:spPr>
+                    <a:xfrm>
+                      <a:off x="0" y="0"/>
+                      <a:ext cx="5943600" cy="3714750"/>
+                    </a:xfrm>
+                    <a:prstGeom prst="rect">
+                      <a:avLst/>
+                    </a:prstGeom>
+                  </pic:spPr>
+                </pic:pic>
+              </a:graphicData>
+            </a:graphic>
+          </wp:inline>
+        </w:drawing>
       </w:r>
     </w:p>
     <w:p>
@@ -21807,20 +22376,45 @@
     </w:p>
     <w:p>
       <w:pPr>
-        <w:spacing w:after="80" w:before="80"/>
-      </w:pPr>
-      <w:r>
-        <w:rPr>
-          <w:rFonts w:ascii="Arial" w:cs="Arial" w:eastAsia="Arial" w:hAnsi="Arial"/>
-          <w:b/>
-          <w:bCs/>
-          <w:i/>
-          <w:iCs/>
-          <w:color w:val="666666"/>
-          <w:sz w:val="20"/>
-          <w:szCs w:val="20"/>
-        </w:rPr>
-        <w:t xml:space="preserve">[SCREENSHOT: 9.6-tenant-detail-page.png]</w:t>
+        <w:jc w:val="center"/>
+        <w:spacing w:after="120" w:before="60"/>
+      </w:pPr>
+      <w:r>
+        <w:drawing>
+          <wp:inline distT="0" distB="0" distL="0" distR="0">
+            <wp:extent cx="5943600" cy="3714750"/>
+            <wp:effectExtent l="0" t="0" r="0" b="0"/>
+            <wp:docPr id="34" name="9_6-tenant-detail-page_png" descr="9.6-tenant-detail-page.png"/>
+            <wp:cNvGraphicFramePr>
+              <a:graphicFrameLocks xmlns:a="http://schemas.openxmlformats.org/drawingml/2006/main" noChangeAspect="1"/>
+            </wp:cNvGraphicFramePr>
+            <a:graphic xmlns:a="http://schemas.openxmlformats.org/drawingml/2006/main">
+              <a:graphicData uri="http://schemas.openxmlformats.org/drawingml/2006/picture">
+                <pic:pic xmlns:pic="http://schemas.openxmlformats.org/drawingml/2006/picture">
+                  <pic:nvPicPr>
+                    <pic:cNvPr id="34" name="9_6-tenant-detail-page_png"/>
+                    <pic:cNvPicPr/>
+                  </pic:nvPicPr>
+                  <pic:blipFill>
+                    <a:blip r:embed="rId43"/>
+                    <a:stretch>
+                      <a:fillRect/>
+                    </a:stretch>
+                  </pic:blipFill>
+                  <pic:spPr>
+                    <a:xfrm>
+                      <a:off x="0" y="0"/>
+                      <a:ext cx="5943600" cy="3714750"/>
+                    </a:xfrm>
+                    <a:prstGeom prst="rect">
+                      <a:avLst/>
+                    </a:prstGeom>
+                  </pic:spPr>
+                </pic:pic>
+              </a:graphicData>
+            </a:graphic>
+          </wp:inline>
+        </w:drawing>
       </w:r>
     </w:p>
     <w:p>
@@ -21879,20 +22473,45 @@
     </w:p>
     <w:p>
       <w:pPr>
-        <w:spacing w:after="80" w:before="80"/>
-      </w:pPr>
-      <w:r>
-        <w:rPr>
-          <w:rFonts w:ascii="Arial" w:cs="Arial" w:eastAsia="Arial" w:hAnsi="Arial"/>
-          <w:b/>
-          <w:bCs/>
-          <w:i/>
-          <w:iCs/>
-          <w:color w:val="666666"/>
-          <w:sz w:val="20"/>
-          <w:szCs w:val="20"/>
-        </w:rPr>
-        <w:t xml:space="preserve">[SCREENSHOT: 9.7-impersonation-banner.png]</w:t>
+        <w:jc w:val="center"/>
+        <w:spacing w:after="120" w:before="60"/>
+      </w:pPr>
+      <w:r>
+        <w:drawing>
+          <wp:inline distT="0" distB="0" distL="0" distR="0">
+            <wp:extent cx="5943600" cy="3714750"/>
+            <wp:effectExtent l="0" t="0" r="0" b="0"/>
+            <wp:docPr id="35" name="9_7-impersonation-banner_png" descr="9.7-impersonation-banner.png"/>
+            <wp:cNvGraphicFramePr>
+              <a:graphicFrameLocks xmlns:a="http://schemas.openxmlformats.org/drawingml/2006/main" noChangeAspect="1"/>
+            </wp:cNvGraphicFramePr>
+            <a:graphic xmlns:a="http://schemas.openxmlformats.org/drawingml/2006/main">
+              <a:graphicData uri="http://schemas.openxmlformats.org/drawingml/2006/picture">
+                <pic:pic xmlns:pic="http://schemas.openxmlformats.org/drawingml/2006/picture">
+                  <pic:nvPicPr>
+                    <pic:cNvPr id="35" name="9_7-impersonation-banner_png"/>
+                    <pic:cNvPicPr/>
+                  </pic:nvPicPr>
+                  <pic:blipFill>
+                    <a:blip r:embed="rId44"/>
+                    <a:stretch>
+                      <a:fillRect/>
+                    </a:stretch>
+                  </pic:blipFill>
+                  <pic:spPr>
+                    <a:xfrm>
+                      <a:off x="0" y="0"/>
+                      <a:ext cx="5943600" cy="3714750"/>
+                    </a:xfrm>
+                    <a:prstGeom prst="rect">
+                      <a:avLst/>
+                    </a:prstGeom>
+                  </pic:spPr>
+                </pic:pic>
+              </a:graphicData>
+            </a:graphic>
+          </wp:inline>
+        </w:drawing>
       </w:r>
     </w:p>
     <w:p>
@@ -23043,20 +23662,45 @@
     </w:p>
     <w:p>
       <w:pPr>
-        <w:spacing w:after="80" w:before="80"/>
-      </w:pPr>
-      <w:r>
-        <w:rPr>
-          <w:rFonts w:ascii="Arial" w:cs="Arial" w:eastAsia="Arial" w:hAnsi="Arial"/>
-          <w:b/>
-          <w:bCs/>
-          <w:i/>
-          <w:iCs/>
-          <w:color w:val="666666"/>
-          <w:sz w:val="20"/>
-          <w:szCs w:val="20"/>
-        </w:rPr>
-        <w:t xml:space="preserve">[SCREENSHOT: 9.9-audit-logs.png]</w:t>
+        <w:jc w:val="center"/>
+        <w:spacing w:after="120" w:before="60"/>
+      </w:pPr>
+      <w:r>
+        <w:drawing>
+          <wp:inline distT="0" distB="0" distL="0" distR="0">
+            <wp:extent cx="5943600" cy="3714750"/>
+            <wp:effectExtent l="0" t="0" r="0" b="0"/>
+            <wp:docPr id="36" name="9_9-audit-logs_png" descr="9.9-audit-logs.png"/>
+            <wp:cNvGraphicFramePr>
+              <a:graphicFrameLocks xmlns:a="http://schemas.openxmlformats.org/drawingml/2006/main" noChangeAspect="1"/>
+            </wp:cNvGraphicFramePr>
+            <a:graphic xmlns:a="http://schemas.openxmlformats.org/drawingml/2006/main">
+              <a:graphicData uri="http://schemas.openxmlformats.org/drawingml/2006/picture">
+                <pic:pic xmlns:pic="http://schemas.openxmlformats.org/drawingml/2006/picture">
+                  <pic:nvPicPr>
+                    <pic:cNvPr id="36" name="9_9-audit-logs_png"/>
+                    <pic:cNvPicPr/>
+                  </pic:nvPicPr>
+                  <pic:blipFill>
+                    <a:blip r:embed="rId45"/>
+                    <a:stretch>
+                      <a:fillRect/>
+                    </a:stretch>
+                  </pic:blipFill>
+                  <pic:spPr>
+                    <a:xfrm>
+                      <a:off x="0" y="0"/>
+                      <a:ext cx="5943600" cy="3714750"/>
+                    </a:xfrm>
+                    <a:prstGeom prst="rect">
+                      <a:avLst/>
+                    </a:prstGeom>
+                  </pic:spPr>
+                </pic:pic>
+              </a:graphicData>
+            </a:graphic>
+          </wp:inline>
+        </w:drawing>
       </w:r>
     </w:p>
     <w:p>

</xml_diff>